<commit_message>
Integrate grading levels across the pack + build offline package zip
Integrate Associate/Professional/Expert grading into the Team Workbook
(how-you'll-be-scored panel), Activity Guide (scoring-by-level), and
Solution Guide (Grading-at-a-glance master rubric + per-pain-point level
cues) — PDF and Word. Bundle all documents into HMF-Offline-Package.zip
(PDF + Word) for one-click distribution.
</commit_message>
<xml_diff>
--- a/case-study-pack/docx/HMF-Activity-Guide.docx
+++ b/case-study-pack/docx/HMF-Activity-Guide.docx
@@ -660,7 +660,7 @@
           <w:sz w:val="24"/>
           <w:szCs w:val="24"/>
         </w:rPr>
-        <w:t xml:space="preserve">Scoring</w:t>
+        <w:t xml:space="preserve">Scoring — by level</w:t>
       </w:r>
     </w:p>
     <w:tbl>
@@ -722,12 +722,231 @@
                 <w:sz w:val="21"/>
                 <w:szCs w:val="21"/>
               </w:rPr>
-              <w:t xml:space="preserve">Marks reward an appropriate product and Solution-Engineer reasoning specific to Cedarline — not generic statements. The proctor grades from the Proctor Guide / Cheat Sheet.</w:t>
+              <w:t xml:space="preserve">Each answer is graded at one of three levels — marks reward an appropriate product and Solution-Engineer reasoning specific to Cedarline, not generic statements.</w:t>
             </w:r>
           </w:p>
         </w:tc>
       </w:tr>
     </w:tbl>
+    <w:p>
+      <w:pPr>
+        <w:spacing w:after="120"/>
+      </w:pPr>
+      <w:r>
+        <w:rPr>
+          <w:rFonts w:ascii="Calibri" w:cs="Calibri" w:eastAsia="Calibri" w:hAnsi="Calibri"/>
+          <w:color w:val="14263A"/>
+          <w:sz w:val="2"/>
+          <w:szCs w:val="2"/>
+        </w:rPr>
+        <w:t xml:space="preserve"/>
+      </w:r>
+    </w:p>
+    <w:tbl>
+      <w:tblPr>
+        <w:tblW w:type="dxa" w:w="9360"/>
+        <w:tblBorders>
+          <w:top w:val="none" w:color="FFFFFF" w:sz="0"/>
+          <w:left w:val="none" w:color="FFFFFF" w:sz="0"/>
+          <w:bottom w:val="none" w:color="FFFFFF" w:sz="0"/>
+          <w:right w:val="none" w:color="FFFFFF" w:sz="0"/>
+          <w:insideH w:val="none" w:color="FFFFFF" w:sz="0"/>
+          <w:insideV w:val="single" w:color="FFFFFF" w:sz="30"/>
+        </w:tblBorders>
+      </w:tblPr>
+      <w:tblGrid>
+        <w:gridCol w:w="3120"/>
+        <w:gridCol w:w="3120"/>
+        <w:gridCol w:w="3120"/>
+      </w:tblGrid>
+      <w:tr>
+        <w:tc>
+          <w:tcPr>
+            <w:tcW w:type="dxa" w:w="3120"/>
+            <w:tcBorders>
+              <w:top w:val="single" w:color="E2891F" w:sz="34"/>
+              <w:left w:val="single" w:color="C4D2E2" w:sz="6"/>
+              <w:bottom w:val="single" w:color="C4D2E2" w:sz="6"/>
+              <w:right w:val="single" w:color="C4D2E2" w:sz="6"/>
+            </w:tcBorders>
+            <w:tcMar>
+              <w:top w:type="dxa" w:w="110"/>
+              <w:left w:type="dxa" w:w="150"/>
+              <w:bottom w:type="dxa" w:w="110"/>
+              <w:right w:type="dxa" w:w="150"/>
+            </w:tcMar>
+            <w:vAlign w:val="top"/>
+          </w:tcPr>
+          <w:p>
+            <w:pPr>
+              <w:spacing w:after="40" w:before="0" w:line="276"/>
+            </w:pPr>
+            <w:r>
+              <w:rPr>
+                <w:rFonts w:ascii="Calibri" w:cs="Calibri" w:eastAsia="Calibri" w:hAnsi="Calibri"/>
+                <w:b/>
+                <w:bCs/>
+                <w:color w:val="B4711A"/>
+                <w:sz w:val="20"/>
+                <w:szCs w:val="20"/>
+              </w:rPr>
+              <w:t xml:space="preserve">Associate</w:t>
+            </w:r>
+            <w:r>
+              <w:rPr>
+                <w:rFonts w:ascii="Calibri" w:cs="Calibri" w:eastAsia="Calibri" w:hAnsi="Calibri"/>
+                <w:color w:val="7E8CA1"/>
+                <w:sz w:val="15"/>
+                <w:szCs w:val="15"/>
+              </w:rPr>
+              <w:t xml:space="preserve">  6–13</w:t>
+            </w:r>
+          </w:p>
+          <w:p>
+            <w:pPr>
+              <w:spacing w:after="0" w:before="0" w:line="276"/>
+            </w:pPr>
+            <w:r>
+              <w:rPr>
+                <w:rFonts w:ascii="Calibri" w:cs="Calibri" w:eastAsia="Calibri" w:hAnsi="Calibri"/>
+                <w:color w:val="33465F"/>
+                <w:sz w:val="18"/>
+                <w:szCs w:val="18"/>
+              </w:rPr>
+              <w:t xml:space="preserve">Name the right product and show you understand the problem.</w:t>
+            </w:r>
+          </w:p>
+        </w:tc>
+        <w:tc>
+          <w:tcPr>
+            <w:tcW w:type="dxa" w:w="3120"/>
+            <w:tcBorders>
+              <w:top w:val="single" w:color="00BCEB" w:sz="34"/>
+              <w:left w:val="single" w:color="C4D2E2" w:sz="6"/>
+              <w:bottom w:val="single" w:color="C4D2E2" w:sz="6"/>
+              <w:right w:val="single" w:color="C4D2E2" w:sz="6"/>
+            </w:tcBorders>
+            <w:tcMar>
+              <w:top w:type="dxa" w:w="110"/>
+              <w:left w:type="dxa" w:w="150"/>
+              <w:bottom w:type="dxa" w:w="110"/>
+              <w:right w:type="dxa" w:w="150"/>
+            </w:tcMar>
+            <w:vAlign w:val="top"/>
+          </w:tcPr>
+          <w:p>
+            <w:pPr>
+              <w:spacing w:after="40" w:before="0" w:line="276"/>
+            </w:pPr>
+            <w:r>
+              <w:rPr>
+                <w:rFonts w:ascii="Calibri" w:cs="Calibri" w:eastAsia="Calibri" w:hAnsi="Calibri"/>
+                <w:b/>
+                <w:bCs/>
+                <w:color w:val="036C8F"/>
+                <w:sz w:val="20"/>
+                <w:szCs w:val="20"/>
+              </w:rPr>
+              <w:t xml:space="preserve">Professional</w:t>
+            </w:r>
+            <w:r>
+              <w:rPr>
+                <w:rFonts w:ascii="Calibri" w:cs="Calibri" w:eastAsia="Calibri" w:hAnsi="Calibri"/>
+                <w:color w:val="7E8CA1"/>
+                <w:sz w:val="15"/>
+                <w:szCs w:val="15"/>
+              </w:rPr>
+              <w:t xml:space="preserve">  14–20</w:t>
+            </w:r>
+          </w:p>
+          <w:p>
+            <w:pPr>
+              <w:spacing w:after="0" w:before="0" w:line="276"/>
+            </w:pPr>
+            <w:r>
+              <w:rPr>
+                <w:rFonts w:ascii="Calibri" w:cs="Calibri" w:eastAsia="Calibri" w:hAnsi="Calibri"/>
+                <w:color w:val="33465F"/>
+                <w:sz w:val="18"/>
+                <w:szCs w:val="18"/>
+              </w:rPr>
+              <w:t xml:space="preserve">Also explain how the product addresses the concern.</w:t>
+            </w:r>
+          </w:p>
+        </w:tc>
+        <w:tc>
+          <w:tcPr>
+            <w:tcW w:type="dxa" w:w="3120"/>
+            <w:tcBorders>
+              <w:top w:val="single" w:color="27A276" w:sz="34"/>
+              <w:left w:val="single" w:color="C4D2E2" w:sz="6"/>
+              <w:bottom w:val="single" w:color="C4D2E2" w:sz="6"/>
+              <w:right w:val="single" w:color="C4D2E2" w:sz="6"/>
+            </w:tcBorders>
+            <w:tcMar>
+              <w:top w:type="dxa" w:w="110"/>
+              <w:left w:type="dxa" w:w="150"/>
+              <w:bottom w:type="dxa" w:w="110"/>
+              <w:right w:type="dxa" w:w="150"/>
+            </w:tcMar>
+            <w:vAlign w:val="top"/>
+          </w:tcPr>
+          <w:p>
+            <w:pPr>
+              <w:spacing w:after="40" w:before="0" w:line="276"/>
+            </w:pPr>
+            <w:r>
+              <w:rPr>
+                <w:rFonts w:ascii="Calibri" w:cs="Calibri" w:eastAsia="Calibri" w:hAnsi="Calibri"/>
+                <w:b/>
+                <w:bCs/>
+                <w:color w:val="1F8A63"/>
+                <w:sz w:val="20"/>
+                <w:szCs w:val="20"/>
+              </w:rPr>
+              <w:t xml:space="preserve">Expert</w:t>
+            </w:r>
+            <w:r>
+              <w:rPr>
+                <w:rFonts w:ascii="Calibri" w:cs="Calibri" w:eastAsia="Calibri" w:hAnsi="Calibri"/>
+                <w:color w:val="7E8CA1"/>
+                <w:sz w:val="15"/>
+                <w:szCs w:val="15"/>
+              </w:rPr>
+              <w:t xml:space="preserve">  21–25</w:t>
+            </w:r>
+          </w:p>
+          <w:p>
+            <w:pPr>
+              <w:spacing w:after="0" w:before="0" w:line="276"/>
+            </w:pPr>
+            <w:r>
+              <w:rPr>
+                <w:rFonts w:ascii="Calibri" w:cs="Calibri" w:eastAsia="Calibri" w:hAnsi="Calibri"/>
+                <w:color w:val="33465F"/>
+                <w:sz w:val="18"/>
+                <w:szCs w:val="18"/>
+              </w:rPr>
+              <w:t xml:space="preserve">Also tie it to Cedarline's specifics and the outcome, and how it fits the wider HMF design.</w:t>
+            </w:r>
+          </w:p>
+        </w:tc>
+      </w:tr>
+    </w:tbl>
+    <w:p>
+      <w:pPr>
+        <w:spacing w:after="0" w:before="120" w:line="276"/>
+      </w:pPr>
+      <w:r>
+        <w:rPr>
+          <w:rFonts w:ascii="Calibri" w:cs="Calibri" w:eastAsia="Calibri" w:hAnsi="Calibri"/>
+          <w:color w:val="7E8CA1"/>
+          <w:sz w:val="17"/>
+          <w:szCs w:val="17"/>
+        </w:rPr>
+        <w:t xml:space="preserve">Bands: Case Study /100 — Associate 40–64 · Professional 65–84 · Expert 85–100. Overall /400 — Associate 160–259 · Professional 260–339 · Expert 340–400. The proctor grades from the Proctor Guide and Proctor Grading Guide.</w:t>
+      </w:r>
+    </w:p>
     <w:sectPr>
       <w:pgSz w:w="12240" w:h="15840" w:orient="portrait"/>
       <w:pgMar w:top="1440" w:right="1440" w:bottom="1440" w:left="1440" w:header="708" w:footer="708" w:gutter="0"/>

</xml_diff>

<commit_message>
Redesign offline pack: instructional design, dual-audience, qualitative Good/Better/Best
Rebuild all four documents from an instructional-design standpoint with an
energetic technical-writer voice for two audiences (security specialists +
generalist SEs): learning objectives, dual-audience callouts, a product
decoder and jargon glossary. Replace numeric Associate/Professional/Expert
scoring with the qualitative Good (Names the fit) / Better (Explains the how)
/ Best (Sells the outcome) growth ladder — no marks, strengths-first coaching
feedback. Solution Guide replaces the old Proctor Guide; numeric cheat sheet
retired. Regenerate PDF + Word and the package zip.
</commit_message>
<xml_diff>
--- a/case-study-pack/docx/HMF-Activity-Guide.docx
+++ b/case-study-pack/docx/HMF-Activity-Guide.docx
@@ -29,8 +29,8 @@
           <w:b/>
           <w:bCs/>
           <w:color w:val="0D274D"/>
-          <w:sz w:val="44"/>
-          <w:szCs w:val="44"/>
+          <w:sz w:val="42"/>
+          <w:szCs w:val="42"/>
         </w:rPr>
         <w:t xml:space="preserve">Activity Guide</w:t>
       </w:r>
@@ -46,7 +46,7 @@
           <w:sz w:val="22"/>
           <w:szCs w:val="22"/>
         </w:rPr>
-        <w:t xml:space="preserve">A one-page overview of the Cedarline Hybrid Mesh Firewall design exercise.</w:t>
+        <w:t xml:space="preserve">Everything a facilitator needs to run the Cedarline HMF clinic.</w:t>
       </w:r>
     </w:p>
     <w:p>
@@ -68,7 +68,7 @@
     </w:p>
     <w:p>
       <w:pPr>
-        <w:spacing w:after="60" w:before="160" w:line="276"/>
+        <w:spacing w:after="80" w:before="180" w:line="276"/>
       </w:pPr>
       <w:r>
         <w:rPr>
@@ -76,10 +76,10 @@
           <w:b/>
           <w:bCs/>
           <w:color w:val="0D274D"/>
-          <w:sz w:val="24"/>
-          <w:szCs w:val="24"/>
-        </w:rPr>
-        <w:t xml:space="preserve">The scenario</w:t>
+          <w:sz w:val="30"/>
+          <w:szCs w:val="30"/>
+        </w:rPr>
+        <w:t xml:space="preserve">The mission</w:t>
       </w:r>
     </w:p>
     <w:p>
@@ -93,12 +93,74 @@
           <w:sz w:val="21"/>
           <w:szCs w:val="21"/>
         </w:rPr>
-        <w:t xml:space="preserve">Cedarline Health Group is a regional healthcare payer-provider — roughly 8,000 employees across four hospitals and thirty-one clinics, plus a claims-processing business that handles the money. Growth by acquisition (including a second data centre absorbed as-is) and a mid-flight, disorderly move to public cloud have left a fragmented security posture. After a security incident in March, the board asked what would have stopped it — and leadership still cannot answer. Budget and executive attention are approved, but explicitly temporary, and the security team is small.</w:t>
-      </w:r>
-    </w:p>
-    <w:p>
-      <w:pPr>
-        <w:spacing w:after="60" w:before="160" w:line="276"/>
+        <w:t xml:space="preserve">Today your team is the Cisco Solution Engineering team walking into Cedarline. You'll sit with four real conversations, hear what's keeping them up at night, and answer as SEs do: the right solution, why it fits, and the outcome it delivers — pulled together into one Hybrid Mesh Firewall design.</w:t>
+      </w:r>
+    </w:p>
+    <w:tbl>
+      <w:tblPr>
+        <w:tblW w:type="dxa" w:w="9360"/>
+        <w:tblBorders>
+          <w:top w:val="single" w:color="auto" w:sz="4"/>
+          <w:left w:val="single" w:color="auto" w:sz="4"/>
+          <w:bottom w:val="single" w:color="auto" w:sz="4"/>
+          <w:right w:val="single" w:color="auto" w:sz="4"/>
+          <w:insideH w:val="single" w:color="auto" w:sz="4"/>
+          <w:insideV w:val="single" w:color="auto" w:sz="4"/>
+        </w:tblBorders>
+      </w:tblPr>
+      <w:tblGrid>
+        <w:gridCol w:w="9360"/>
+      </w:tblGrid>
+      <w:tr>
+        <w:tc>
+          <w:tcPr>
+            <w:tcW w:type="dxa" w:w="9360"/>
+            <w:tcBorders>
+              <w:top w:val="single" w:color="DCE6F1" w:sz="6"/>
+              <w:left w:val="single" w:color="DCE6F1" w:sz="6"/>
+              <w:bottom w:val="single" w:color="DCE6F1" w:sz="6"/>
+              <w:right w:val="single" w:color="DCE6F1" w:sz="6"/>
+            </w:tcBorders>
+            <w:shd w:fill="F3F7FB" w:color="auto" w:val="clear"/>
+            <w:tcMar>
+              <w:top w:type="dxa" w:w="110"/>
+              <w:left w:type="dxa" w:w="160"/>
+              <w:bottom w:type="dxa" w:w="110"/>
+              <w:right w:type="dxa" w:w="160"/>
+            </w:tcMar>
+            <w:vAlign w:val="top"/>
+          </w:tcPr>
+          <w:p>
+            <w:pPr>
+              <w:spacing w:after="0" w:before="0" w:line="276"/>
+            </w:pPr>
+            <w:r>
+              <w:rPr>
+                <w:rFonts w:ascii="Calibri" w:cs="Calibri" w:eastAsia="Calibri" w:hAnsi="Calibri"/>
+                <w:b/>
+                <w:bCs/>
+                <w:color w:val="0D274D"/>
+                <w:sz w:val="20"/>
+                <w:szCs w:val="20"/>
+              </w:rPr>
+              <w:t xml:space="preserve">The customer.  </w:t>
+            </w:r>
+            <w:r>
+              <w:rPr>
+                <w:rFonts w:ascii="Calibri" w:cs="Calibri" w:eastAsia="Calibri" w:hAnsi="Calibri"/>
+                <w:color w:val="33465F"/>
+                <w:sz w:val="20"/>
+                <w:szCs w:val="20"/>
+              </w:rPr>
+              <w:t xml:space="preserve">Cedarline Health Group is a regional healthcare payer-provider — roughly 8,000 employees across four hospitals and thirty-one clinics, plus a claims-processing business that handles the money. Growth by acquisition (including a second data centre absorbed as-is) and a mid-flight, disorderly move to public cloud have left a fragmented security posture. After a security incident in March, the board asked what would have stopped it — and leadership still cannot answer. Budget and executive attention are approved, but explicitly temporary, and the security team is small.</w:t>
+            </w:r>
+          </w:p>
+        </w:tc>
+      </w:tr>
+    </w:tbl>
+    <w:p>
+      <w:pPr>
+        <w:spacing w:after="80" w:before="180" w:line="276"/>
       </w:pPr>
       <w:r>
         <w:rPr>
@@ -106,29 +168,312 @@
           <w:b/>
           <w:bCs/>
           <w:color w:val="0D274D"/>
-          <w:sz w:val="24"/>
-          <w:szCs w:val="24"/>
-        </w:rPr>
-        <w:t xml:space="preserve">Your role</w:t>
-      </w:r>
-    </w:p>
-    <w:p>
-      <w:pPr>
-        <w:spacing w:after="120" w:before="0" w:line="276"/>
-      </w:pPr>
-      <w:r>
-        <w:rPr>
-          <w:rFonts w:ascii="Calibri" w:cs="Calibri" w:eastAsia="Calibri" w:hAnsi="Calibri"/>
-          <w:color w:val="33465F"/>
-          <w:sz w:val="21"/>
-          <w:szCs w:val="21"/>
-        </w:rPr>
-        <w:t xml:space="preserve">Your team acts as Cisco Solution Engineers. Work each Case Study below: for every pain point, name the Cisco product/platform that fits and write the Solution-Engineer response — how it addresses Cedarline's concern and how it helps — then bring it together as a Hybrid Mesh Firewall design.</w:t>
-      </w:r>
-    </w:p>
-    <w:p>
-      <w:pPr>
-        <w:spacing w:after="60" w:before="160" w:line="276"/>
+          <w:sz w:val="30"/>
+          <w:szCs w:val="30"/>
+        </w:rPr>
+        <w:t xml:space="preserve">Learning objectives</w:t>
+      </w:r>
+    </w:p>
+    <w:tbl>
+      <w:tblPr>
+        <w:tblW w:type="dxa" w:w="9360"/>
+        <w:tblBorders>
+          <w:top w:val="single" w:color="C4D2E2" w:sz="6"/>
+          <w:left w:val="single" w:color="C4D2E2" w:sz="6"/>
+          <w:bottom w:val="single" w:color="C4D2E2" w:sz="6"/>
+          <w:right w:val="single" w:color="C4D2E2" w:sz="6"/>
+          <w:insideH w:val="none" w:color="FFFFFF" w:sz="0"/>
+          <w:insideV w:val="none" w:color="FFFFFF" w:sz="0"/>
+        </w:tblBorders>
+      </w:tblPr>
+      <w:tblGrid>
+        <w:gridCol w:w="640"/>
+        <w:gridCol w:w="8720"/>
+      </w:tblGrid>
+      <w:tr>
+        <w:tc>
+          <w:tcPr>
+            <w:tcW w:type="dxa" w:w="640"/>
+            <w:tcBorders>
+              <w:top w:val="none" w:color="FFFFFF" w:sz="0"/>
+              <w:left w:val="none" w:color="FFFFFF" w:sz="0"/>
+              <w:bottom w:val="none" w:color="FFFFFF" w:sz="0"/>
+              <w:right w:val="none" w:color="FFFFFF" w:sz="0"/>
+            </w:tcBorders>
+            <w:shd w:fill="00BCEB" w:color="auto" w:val="clear"/>
+            <w:tcMar>
+              <w:top w:type="dxa" w:w="70"/>
+              <w:left w:type="dxa" w:w="150"/>
+              <w:bottom w:type="dxa" w:w="70"/>
+              <w:right w:type="dxa" w:w="80"/>
+            </w:tcMar>
+            <w:vAlign w:val="center"/>
+          </w:tcPr>
+          <w:p>
+            <w:pPr>
+              <w:spacing w:after="0" w:before="0" w:line="276"/>
+              <w:jc w:val="center"/>
+            </w:pPr>
+            <w:r>
+              <w:rPr>
+                <w:rFonts w:ascii="Calibri" w:cs="Calibri" w:eastAsia="Calibri" w:hAnsi="Calibri"/>
+                <w:b/>
+                <w:bCs/>
+                <w:color w:val="04283A"/>
+                <w:sz w:val="19"/>
+                <w:szCs w:val="19"/>
+              </w:rPr>
+              <w:t xml:space="preserve">1</w:t>
+            </w:r>
+          </w:p>
+        </w:tc>
+        <w:tc>
+          <w:tcPr>
+            <w:tcW w:type="dxa" w:w="8720"/>
+            <w:tcBorders>
+              <w:top w:val="none" w:color="FFFFFF" w:sz="0"/>
+              <w:left w:val="none" w:color="FFFFFF" w:sz="0"/>
+              <w:bottom w:val="none" w:color="FFFFFF" w:sz="0"/>
+              <w:right w:val="none" w:color="FFFFFF" w:sz="0"/>
+            </w:tcBorders>
+            <w:tcMar>
+              <w:top w:type="dxa" w:w="80"/>
+              <w:left w:type="dxa" w:w="150"/>
+              <w:bottom w:type="dxa" w:w="80"/>
+              <w:right w:type="dxa" w:w="140"/>
+            </w:tcMar>
+            <w:vAlign w:val="center"/>
+          </w:tcPr>
+          <w:p>
+            <w:pPr>
+              <w:spacing w:after="0" w:before="0" w:line="276"/>
+            </w:pPr>
+            <w:r>
+              <w:rPr>
+                <w:rFonts w:ascii="Calibri" w:cs="Calibri" w:eastAsia="Calibri" w:hAnsi="Calibri"/>
+                <w:color w:val="33465F"/>
+                <w:sz w:val="21"/>
+                <w:szCs w:val="21"/>
+              </w:rPr>
+              <w:t xml:space="preserve">Map Cedarline's stated concerns to the right Cisco Secure solutions.</w:t>
+            </w:r>
+          </w:p>
+        </w:tc>
+      </w:tr>
+      <w:tr>
+        <w:tc>
+          <w:tcPr>
+            <w:tcW w:type="dxa" w:w="640"/>
+            <w:tcBorders>
+              <w:top w:val="single" w:color="E4EBF3" w:sz="4"/>
+              <w:left w:val="none" w:color="FFFFFF" w:sz="0"/>
+              <w:bottom w:val="none" w:color="FFFFFF" w:sz="0"/>
+              <w:right w:val="none" w:color="FFFFFF" w:sz="0"/>
+            </w:tcBorders>
+            <w:shd w:fill="00BCEB" w:color="auto" w:val="clear"/>
+            <w:tcMar>
+              <w:top w:type="dxa" w:w="70"/>
+              <w:left w:type="dxa" w:w="150"/>
+              <w:bottom w:type="dxa" w:w="70"/>
+              <w:right w:type="dxa" w:w="80"/>
+            </w:tcMar>
+            <w:vAlign w:val="center"/>
+          </w:tcPr>
+          <w:p>
+            <w:pPr>
+              <w:spacing w:after="0" w:before="0" w:line="276"/>
+              <w:jc w:val="center"/>
+            </w:pPr>
+            <w:r>
+              <w:rPr>
+                <w:rFonts w:ascii="Calibri" w:cs="Calibri" w:eastAsia="Calibri" w:hAnsi="Calibri"/>
+                <w:b/>
+                <w:bCs/>
+                <w:color w:val="04283A"/>
+                <w:sz w:val="19"/>
+                <w:szCs w:val="19"/>
+              </w:rPr>
+              <w:t xml:space="preserve">2</w:t>
+            </w:r>
+          </w:p>
+        </w:tc>
+        <w:tc>
+          <w:tcPr>
+            <w:tcW w:type="dxa" w:w="8720"/>
+            <w:tcBorders>
+              <w:top w:val="single" w:color="E4EBF3" w:sz="4"/>
+              <w:left w:val="none" w:color="FFFFFF" w:sz="0"/>
+              <w:bottom w:val="none" w:color="FFFFFF" w:sz="0"/>
+              <w:right w:val="none" w:color="FFFFFF" w:sz="0"/>
+            </w:tcBorders>
+            <w:tcMar>
+              <w:top w:type="dxa" w:w="80"/>
+              <w:left w:type="dxa" w:w="150"/>
+              <w:bottom w:type="dxa" w:w="80"/>
+              <w:right w:type="dxa" w:w="140"/>
+            </w:tcMar>
+            <w:vAlign w:val="center"/>
+          </w:tcPr>
+          <w:p>
+            <w:pPr>
+              <w:spacing w:after="0" w:before="0" w:line="276"/>
+            </w:pPr>
+            <w:r>
+              <w:rPr>
+                <w:rFonts w:ascii="Calibri" w:cs="Calibri" w:eastAsia="Calibri" w:hAnsi="Calibri"/>
+                <w:color w:val="33465F"/>
+                <w:sz w:val="21"/>
+                <w:szCs w:val="21"/>
+              </w:rPr>
+              <w:t xml:space="preserve">Explain, in the customer's language, how each solution addresses the concern.</w:t>
+            </w:r>
+          </w:p>
+        </w:tc>
+      </w:tr>
+      <w:tr>
+        <w:tc>
+          <w:tcPr>
+            <w:tcW w:type="dxa" w:w="640"/>
+            <w:tcBorders>
+              <w:top w:val="single" w:color="E4EBF3" w:sz="4"/>
+              <w:left w:val="none" w:color="FFFFFF" w:sz="0"/>
+              <w:bottom w:val="none" w:color="FFFFFF" w:sz="0"/>
+              <w:right w:val="none" w:color="FFFFFF" w:sz="0"/>
+            </w:tcBorders>
+            <w:shd w:fill="00BCEB" w:color="auto" w:val="clear"/>
+            <w:tcMar>
+              <w:top w:type="dxa" w:w="70"/>
+              <w:left w:type="dxa" w:w="150"/>
+              <w:bottom w:type="dxa" w:w="70"/>
+              <w:right w:type="dxa" w:w="80"/>
+            </w:tcMar>
+            <w:vAlign w:val="center"/>
+          </w:tcPr>
+          <w:p>
+            <w:pPr>
+              <w:spacing w:after="0" w:before="0" w:line="276"/>
+              <w:jc w:val="center"/>
+            </w:pPr>
+            <w:r>
+              <w:rPr>
+                <w:rFonts w:ascii="Calibri" w:cs="Calibri" w:eastAsia="Calibri" w:hAnsi="Calibri"/>
+                <w:b/>
+                <w:bCs/>
+                <w:color w:val="04283A"/>
+                <w:sz w:val="19"/>
+                <w:szCs w:val="19"/>
+              </w:rPr>
+              <w:t xml:space="preserve">3</w:t>
+            </w:r>
+          </w:p>
+        </w:tc>
+        <w:tc>
+          <w:tcPr>
+            <w:tcW w:type="dxa" w:w="8720"/>
+            <w:tcBorders>
+              <w:top w:val="single" w:color="E4EBF3" w:sz="4"/>
+              <w:left w:val="none" w:color="FFFFFF" w:sz="0"/>
+              <w:bottom w:val="none" w:color="FFFFFF" w:sz="0"/>
+              <w:right w:val="none" w:color="FFFFFF" w:sz="0"/>
+            </w:tcBorders>
+            <w:tcMar>
+              <w:top w:type="dxa" w:w="80"/>
+              <w:left w:type="dxa" w:w="150"/>
+              <w:bottom w:type="dxa" w:w="80"/>
+              <w:right w:type="dxa" w:w="140"/>
+            </w:tcMar>
+            <w:vAlign w:val="center"/>
+          </w:tcPr>
+          <w:p>
+            <w:pPr>
+              <w:spacing w:after="0" w:before="0" w:line="276"/>
+            </w:pPr>
+            <w:r>
+              <w:rPr>
+                <w:rFonts w:ascii="Calibri" w:cs="Calibri" w:eastAsia="Calibri" w:hAnsi="Calibri"/>
+                <w:color w:val="33465F"/>
+                <w:sz w:val="21"/>
+                <w:szCs w:val="21"/>
+              </w:rPr>
+              <w:t xml:space="preserve">Connect the four case studies into one coherent Hybrid Mesh Firewall design.</w:t>
+            </w:r>
+          </w:p>
+        </w:tc>
+      </w:tr>
+      <w:tr>
+        <w:tc>
+          <w:tcPr>
+            <w:tcW w:type="dxa" w:w="640"/>
+            <w:tcBorders>
+              <w:top w:val="single" w:color="E4EBF3" w:sz="4"/>
+              <w:left w:val="none" w:color="FFFFFF" w:sz="0"/>
+              <w:bottom w:val="none" w:color="FFFFFF" w:sz="0"/>
+              <w:right w:val="none" w:color="FFFFFF" w:sz="0"/>
+            </w:tcBorders>
+            <w:shd w:fill="00BCEB" w:color="auto" w:val="clear"/>
+            <w:tcMar>
+              <w:top w:type="dxa" w:w="70"/>
+              <w:left w:type="dxa" w:w="150"/>
+              <w:bottom w:type="dxa" w:w="70"/>
+              <w:right w:type="dxa" w:w="80"/>
+            </w:tcMar>
+            <w:vAlign w:val="center"/>
+          </w:tcPr>
+          <w:p>
+            <w:pPr>
+              <w:spacing w:after="0" w:before="0" w:line="276"/>
+              <w:jc w:val="center"/>
+            </w:pPr>
+            <w:r>
+              <w:rPr>
+                <w:rFonts w:ascii="Calibri" w:cs="Calibri" w:eastAsia="Calibri" w:hAnsi="Calibri"/>
+                <w:b/>
+                <w:bCs/>
+                <w:color w:val="04283A"/>
+                <w:sz w:val="19"/>
+                <w:szCs w:val="19"/>
+              </w:rPr>
+              <w:t xml:space="preserve">4</w:t>
+            </w:r>
+          </w:p>
+        </w:tc>
+        <w:tc>
+          <w:tcPr>
+            <w:tcW w:type="dxa" w:w="8720"/>
+            <w:tcBorders>
+              <w:top w:val="single" w:color="E4EBF3" w:sz="4"/>
+              <w:left w:val="none" w:color="FFFFFF" w:sz="0"/>
+              <w:bottom w:val="none" w:color="FFFFFF" w:sz="0"/>
+              <w:right w:val="none" w:color="FFFFFF" w:sz="0"/>
+            </w:tcBorders>
+            <w:tcMar>
+              <w:top w:type="dxa" w:w="80"/>
+              <w:left w:type="dxa" w:w="150"/>
+              <w:bottom w:type="dxa" w:w="80"/>
+              <w:right w:type="dxa" w:w="140"/>
+            </w:tcMar>
+            <w:vAlign w:val="center"/>
+          </w:tcPr>
+          <w:p>
+            <w:pPr>
+              <w:spacing w:after="0" w:before="0" w:line="276"/>
+            </w:pPr>
+            <w:r>
+              <w:rPr>
+                <w:rFonts w:ascii="Calibri" w:cs="Calibri" w:eastAsia="Calibri" w:hAnsi="Calibri"/>
+                <w:color w:val="33465F"/>
+                <w:sz w:val="21"/>
+                <w:szCs w:val="21"/>
+              </w:rPr>
+              <w:t xml:space="preserve">Present the outcome — the business result — not just the feature.</w:t>
+            </w:r>
+          </w:p>
+        </w:tc>
+      </w:tr>
+    </w:tbl>
+    <w:p>
+      <w:pPr>
+        <w:spacing w:after="80" w:before="180" w:line="276"/>
       </w:pPr>
       <w:r>
         <w:rPr>
@@ -136,10 +481,143 @@
           <w:b/>
           <w:bCs/>
           <w:color w:val="0D274D"/>
-          <w:sz w:val="24"/>
-          <w:szCs w:val="24"/>
-        </w:rPr>
-        <w:t xml:space="preserve">The four Case Studies</w:t>
+          <w:sz w:val="30"/>
+          <w:szCs w:val="30"/>
+        </w:rPr>
+        <w:t xml:space="preserve">Built for every SE in the room</w:t>
+      </w:r>
+    </w:p>
+    <w:tbl>
+      <w:tblPr>
+        <w:tblW w:type="dxa" w:w="9360"/>
+        <w:tblBorders>
+          <w:top w:val="none" w:color="FFFFFF" w:sz="0"/>
+          <w:left w:val="none" w:color="FFFFFF" w:sz="0"/>
+          <w:bottom w:val="none" w:color="FFFFFF" w:sz="0"/>
+          <w:right w:val="none" w:color="FFFFFF" w:sz="0"/>
+          <w:insideH w:val="none" w:color="FFFFFF" w:sz="0"/>
+          <w:insideV w:val="single" w:color="FFFFFF" w:sz="60"/>
+        </w:tblBorders>
+      </w:tblPr>
+      <w:tblGrid>
+        <w:gridCol w:w="4680"/>
+        <w:gridCol w:w="4680"/>
+      </w:tblGrid>
+      <w:tr>
+        <w:tc>
+          <w:tcPr>
+            <w:tcW w:type="dxa" w:w="4680"/>
+            <w:tcBorders>
+              <w:top w:val="single" w:color="BEE6F2" w:sz="6"/>
+              <w:left w:val="single" w:color="BEE6F2" w:sz="6"/>
+              <w:bottom w:val="single" w:color="BEE6F2" w:sz="6"/>
+              <w:right w:val="single" w:color="BEE6F2" w:sz="6"/>
+            </w:tcBorders>
+            <w:shd w:fill="EAF7FB" w:color="auto" w:val="clear"/>
+            <w:tcMar>
+              <w:top w:type="dxa" w:w="110"/>
+              <w:left w:type="dxa" w:w="140"/>
+              <w:bottom w:type="dxa" w:w="110"/>
+              <w:right w:type="dxa" w:w="140"/>
+            </w:tcMar>
+          </w:tcPr>
+          <w:p>
+            <w:pPr>
+              <w:spacing w:after="50" w:before="0" w:line="276"/>
+            </w:pPr>
+            <w:r>
+              <w:rPr>
+                <w:rFonts w:ascii="Calibri" w:cs="Calibri" w:eastAsia="Calibri" w:hAnsi="Calibri"/>
+                <w:b/>
+                <w:bCs/>
+                <w:caps/>
+                <w:color w:val="0E6E90"/>
+                <w:sz w:val="16"/>
+                <w:szCs w:val="16"/>
+              </w:rPr>
+              <w:t xml:space="preserve">🧭 New to this area?</w:t>
+            </w:r>
+          </w:p>
+          <w:p>
+            <w:pPr>
+              <w:spacing w:after="0" w:before="0" w:line="276"/>
+            </w:pPr>
+            <w:r>
+              <w:rPr>
+                <w:rFonts w:ascii="Calibri" w:cs="Calibri" w:eastAsia="Calibri" w:hAnsi="Calibri"/>
+                <w:color w:val="134A5E"/>
+                <w:sz w:val="18"/>
+                <w:szCs w:val="18"/>
+              </w:rPr>
+              <w:t xml:space="preserve">Plain-language framing of what the customer is really asking — no security background assumed.</w:t>
+            </w:r>
+          </w:p>
+        </w:tc>
+        <w:tc>
+          <w:tcPr>
+            <w:tcW w:type="dxa" w:w="4680"/>
+            <w:tcBorders>
+              <w:top w:val="single" w:color="D6CBF0" w:sz="6"/>
+              <w:left w:val="single" w:color="D6CBF0" w:sz="6"/>
+              <w:bottom w:val="single" w:color="D6CBF0" w:sz="6"/>
+              <w:right w:val="single" w:color="D6CBF0" w:sz="6"/>
+            </w:tcBorders>
+            <w:shd w:fill="F1ECFA" w:color="auto" w:val="clear"/>
+            <w:tcMar>
+              <w:top w:type="dxa" w:w="110"/>
+              <w:left w:type="dxa" w:w="140"/>
+              <w:bottom w:type="dxa" w:w="110"/>
+              <w:right w:type="dxa" w:w="140"/>
+            </w:tcMar>
+          </w:tcPr>
+          <w:p>
+            <w:pPr>
+              <w:spacing w:after="50" w:before="0" w:line="276"/>
+            </w:pPr>
+            <w:r>
+              <w:rPr>
+                <w:rFonts w:ascii="Calibri" w:cs="Calibri" w:eastAsia="Calibri" w:hAnsi="Calibri"/>
+                <w:b/>
+                <w:bCs/>
+                <w:caps/>
+                <w:color w:val="5B3FBC"/>
+                <w:sz w:val="16"/>
+                <w:szCs w:val="16"/>
+              </w:rPr>
+              <w:t xml:space="preserve">🔐 For security specialists</w:t>
+            </w:r>
+          </w:p>
+          <w:p>
+            <w:pPr>
+              <w:spacing w:after="0" w:before="0" w:line="276"/>
+            </w:pPr>
+            <w:r>
+              <w:rPr>
+                <w:rFonts w:ascii="Calibri" w:cs="Calibri" w:eastAsia="Calibri" w:hAnsi="Calibri"/>
+                <w:color w:val="3E2E73"/>
+                <w:sz w:val="18"/>
+                <w:szCs w:val="18"/>
+              </w:rPr>
+              <w:t xml:space="preserve">The deeper technical angle and the specific Cisco capabilities in play.</w:t>
+            </w:r>
+          </w:p>
+        </w:tc>
+      </w:tr>
+    </w:tbl>
+    <w:p>
+      <w:pPr>
+        <w:spacing w:after="80" w:before="180" w:line="276"/>
+      </w:pPr>
+      <w:r>
+        <w:rPr>
+          <w:rFonts w:ascii="Calibri" w:cs="Calibri" w:eastAsia="Calibri" w:hAnsi="Calibri"/>
+          <w:b/>
+          <w:bCs/>
+          <w:color w:val="0D274D"/>
+          <w:sz w:val="30"/>
+          <w:szCs w:val="30"/>
+        </w:rPr>
+        <w:t xml:space="preserve">The four case studies</w:t>
       </w:r>
     </w:p>
     <w:tbl>
@@ -187,8 +665,8 @@
                 <w:b/>
                 <w:bCs/>
                 <w:color w:val="0D274D"/>
-                <w:sz w:val="26"/>
-                <w:szCs w:val="26"/>
+                <w:sz w:val="24"/>
+                <w:szCs w:val="24"/>
               </w:rPr>
               <w:t xml:space="preserve">1</w:t>
             </w:r>
@@ -220,8 +698,8 @@
                 <w:b/>
                 <w:bCs/>
                 <w:color w:val="0D274D"/>
-                <w:sz w:val="21"/>
-                <w:szCs w:val="21"/>
+                <w:sz w:val="20"/>
+                <w:szCs w:val="20"/>
               </w:rPr>
               <w:t xml:space="preserve">Case Study 1 — AI Security</w:t>
             </w:r>
@@ -234,8 +712,8 @@
               <w:rPr>
                 <w:rFonts w:ascii="Calibri" w:cs="Calibri" w:eastAsia="Calibri" w:hAnsi="Calibri"/>
                 <w:color w:val="3A4C63"/>
-                <w:sz w:val="19"/>
-                <w:szCs w:val="19"/>
+                <w:sz w:val="18"/>
+                <w:szCs w:val="18"/>
               </w:rPr>
               <w:t xml:space="preserve">Cedarline is standing up AI across regulated workflows and public cloud faster than security can see it. Help them prove compliance, vet what they adopt, and get visibility and guardrails over AI traffic.</w:t>
             </w:r>
@@ -271,8 +749,8 @@
                 <w:b/>
                 <w:bCs/>
                 <w:color w:val="0D274D"/>
-                <w:sz w:val="26"/>
-                <w:szCs w:val="26"/>
+                <w:sz w:val="24"/>
+                <w:szCs w:val="24"/>
               </w:rPr>
               <w:t xml:space="preserve">2</w:t>
             </w:r>
@@ -304,8 +782,8 @@
                 <w:b/>
                 <w:bCs/>
                 <w:color w:val="0D274D"/>
-                <w:sz w:val="21"/>
-                <w:szCs w:val="21"/>
+                <w:sz w:val="20"/>
+                <w:szCs w:val="20"/>
               </w:rPr>
               <w:t xml:space="preserve">Case Study 2 — Cloud Edge</w:t>
             </w:r>
@@ -318,8 +796,8 @@
               <w:rPr>
                 <w:rFonts w:ascii="Calibri" w:cs="Calibri" w:eastAsia="Calibri" w:hAnsi="Calibri"/>
                 <w:color w:val="3A4C63"/>
-                <w:sz w:val="19"/>
-                <w:szCs w:val="19"/>
+                <w:sz w:val="18"/>
+                <w:szCs w:val="18"/>
               </w:rPr>
               <w:t xml:space="preserve">Workloads sprawl across AWS, Azure and on-prem, each with its own policy model. Contain lateral movement, prove consistent controls to auditors, and give Cedarline one place to define and enforce policy.</w:t>
             </w:r>
@@ -355,8 +833,8 @@
                 <w:b/>
                 <w:bCs/>
                 <w:color w:val="0D274D"/>
-                <w:sz w:val="26"/>
-                <w:szCs w:val="26"/>
+                <w:sz w:val="24"/>
+                <w:szCs w:val="24"/>
               </w:rPr>
               <w:t xml:space="preserve">3</w:t>
             </w:r>
@@ -388,10 +866,10 @@
                 <w:b/>
                 <w:bCs/>
                 <w:color w:val="0D274D"/>
-                <w:sz w:val="21"/>
-                <w:szCs w:val="21"/>
-              </w:rPr>
-              <w:t xml:space="preserve">Case Study 3 — DC Edge — Perimeter Firewall</w:t>
+                <w:sz w:val="20"/>
+                <w:szCs w:val="20"/>
+              </w:rPr>
+              <w:t xml:space="preserve">Case Study 3 — DC Edge · Perimeter Firewall</w:t>
             </w:r>
           </w:p>
           <w:p>
@@ -402,8 +880,8 @@
               <w:rPr>
                 <w:rFonts w:ascii="Calibri" w:cs="Calibri" w:eastAsia="Calibri" w:hAnsi="Calibri"/>
                 <w:color w:val="3A4C63"/>
-                <w:sz w:val="19"/>
-                <w:szCs w:val="19"/>
+                <w:sz w:val="18"/>
+                <w:szCs w:val="18"/>
               </w:rPr>
               <w:t xml:space="preserve">A mixed-vendor perimeter, an inherited rulebase and mostly-encrypted traffic leave blind spots and slow response. Restore visibility, speed the response, and modernise detection with the team they have.</w:t>
             </w:r>
@@ -439,8 +917,8 @@
                 <w:b/>
                 <w:bCs/>
                 <w:color w:val="0D274D"/>
-                <w:sz w:val="26"/>
-                <w:szCs w:val="26"/>
+                <w:sz w:val="24"/>
+                <w:szCs w:val="24"/>
               </w:rPr>
               <w:t xml:space="preserve">4</w:t>
             </w:r>
@@ -472,8 +950,8 @@
                 <w:b/>
                 <w:bCs/>
                 <w:color w:val="0D274D"/>
-                <w:sz w:val="21"/>
-                <w:szCs w:val="21"/>
+                <w:sz w:val="20"/>
+                <w:szCs w:val="20"/>
               </w:rPr>
               <w:t xml:space="preserve">Case Study 4 — Macro &amp; Micro Segmentation</w:t>
             </w:r>
@@ -486,8 +964,8 @@
               <w:rPr>
                 <w:rFonts w:ascii="Calibri" w:cs="Calibri" w:eastAsia="Calibri" w:hAnsi="Calibri"/>
                 <w:color w:val="3A4C63"/>
-                <w:sz w:val="19"/>
-                <w:szCs w:val="19"/>
+                <w:sz w:val="18"/>
+                <w:szCs w:val="18"/>
               </w:rPr>
               <w:t xml:space="preserve">A flat data centre and fragmented Kubernetes networking invite east-west movement. Build segmentation Cedarline can adopt safely — with runtime visibility and application-dependency awareness so nothing breaks.</w:t>
             </w:r>
@@ -497,7 +975,7 @@
     </w:tbl>
     <w:p>
       <w:pPr>
-        <w:spacing w:after="60" w:before="160" w:line="276"/>
+        <w:spacing w:after="80" w:before="180" w:line="276"/>
       </w:pPr>
       <w:r>
         <w:rPr>
@@ -505,8 +983,8 @@
           <w:b/>
           <w:bCs/>
           <w:color w:val="0D274D"/>
-          <w:sz w:val="24"/>
-          <w:szCs w:val="24"/>
+          <w:sz w:val="30"/>
+          <w:szCs w:val="30"/>
         </w:rPr>
         <w:t xml:space="preserve">How to run it</w:t>
       </w:r>
@@ -522,7 +1000,7 @@
           <w:sz w:val="21"/>
           <w:szCs w:val="21"/>
         </w:rPr>
-        <w:t xml:space="preserve">•  Teams of 3–5. Each team gets a </w:t>
+        <w:t xml:space="preserve">•  Teams of 3–5, mixing specialists and generalists. Each team gets a </w:t>
       </w:r>
       <w:r>
         <w:rPr>
@@ -556,7 +1034,7 @@
           <w:sz w:val="21"/>
           <w:szCs w:val="21"/>
         </w:rPr>
-        <w:t xml:space="preserve">•  Work all four Case Studies — four pain points each. For every pain point, name the </w:t>
+        <w:t xml:space="preserve">•  Work all four case studies — four pain points each. For every one: the </w:t>
       </w:r>
       <w:r>
         <w:rPr>
@@ -576,7 +1054,7 @@
           <w:sz w:val="21"/>
           <w:szCs w:val="21"/>
         </w:rPr>
-        <w:t xml:space="preserve"> and write the Solution-Engineer response (how it addresses the concern and how it helps).</w:t>
+        <w:t xml:space="preserve"> and the SE response (how it addresses the concern and the outcome).</w:t>
       </w:r>
     </w:p>
     <w:p>
@@ -610,7 +1088,7 @@
           <w:sz w:val="21"/>
           <w:szCs w:val="21"/>
         </w:rPr>
-        <w:t xml:space="preserve"> — paste/draw it on the last page of the workbook.</w:t>
+        <w:t xml:space="preserve"> — paste/draw it on the last page.</w:t>
       </w:r>
     </w:p>
     <w:p>
@@ -624,7 +1102,7 @@
           <w:sz w:val="21"/>
           <w:szCs w:val="21"/>
         </w:rPr>
-        <w:t xml:space="preserve">•  Suggested timing: ~10 min per Case Study, ~15 min for the topology and readout.</w:t>
+        <w:t xml:space="preserve">•  Suggested timing: ~10 min per case study, ~15 min for the topology and readout.</w:t>
       </w:r>
       <w:r>
         <w:rPr>
@@ -649,7 +1127,7 @@
     </w:p>
     <w:p>
       <w:pPr>
-        <w:spacing w:after="60" w:before="160" w:line="276"/>
+        <w:spacing w:after="80" w:before="180" w:line="276"/>
       </w:pPr>
       <w:r>
         <w:rPr>
@@ -657,89 +1135,44 @@
           <w:b/>
           <w:bCs/>
           <w:color w:val="0D274D"/>
-          <w:sz w:val="24"/>
-          <w:szCs w:val="24"/>
-        </w:rPr>
-        <w:t xml:space="preserve">Scoring — by level</w:t>
-      </w:r>
-    </w:p>
-    <w:tbl>
-      <w:tblPr>
-        <w:tblW w:type="dxa" w:w="9360"/>
-        <w:tblBorders>
-          <w:top w:val="single" w:color="auto" w:sz="4"/>
-          <w:left w:val="single" w:color="auto" w:sz="4"/>
-          <w:bottom w:val="single" w:color="auto" w:sz="4"/>
-          <w:right w:val="single" w:color="auto" w:sz="4"/>
-          <w:insideH w:val="single" w:color="auto" w:sz="4"/>
-          <w:insideV w:val="single" w:color="auto" w:sz="4"/>
-        </w:tblBorders>
-      </w:tblPr>
-      <w:tblGrid>
-        <w:gridCol w:w="9360"/>
-      </w:tblGrid>
-      <w:tr>
-        <w:trPr>
-          <w:trHeight w:val="0" w:hRule="atLeast"/>
-        </w:trPr>
-        <w:tc>
-          <w:tcPr>
-            <w:tcW w:type="dxa" w:w="9360"/>
-            <w:tcBorders>
-              <w:top w:val="single" w:color="DCE6F1" w:sz="6"/>
-              <w:left w:val="single" w:color="DCE6F1" w:sz="6"/>
-              <w:bottom w:val="single" w:color="DCE6F1" w:sz="6"/>
-              <w:right w:val="single" w:color="DCE6F1" w:sz="6"/>
-            </w:tcBorders>
-            <w:shd w:fill="F3F7FB" w:color="auto" w:val="clear"/>
-            <w:tcMar>
-              <w:top w:type="dxa" w:w="120"/>
-              <w:left w:type="dxa" w:w="160"/>
-              <w:bottom w:type="dxa" w:w="120"/>
-              <w:right w:type="dxa" w:w="160"/>
-            </w:tcMar>
-            <w:vAlign w:val="top"/>
-          </w:tcPr>
-          <w:p>
-            <w:pPr>
-              <w:spacing w:after="0" w:before="0" w:line="276"/>
-            </w:pPr>
-            <w:r>
-              <w:rPr>
-                <w:rFonts w:ascii="Calibri" w:cs="Calibri" w:eastAsia="Calibri" w:hAnsi="Calibri"/>
-                <w:b/>
-                <w:bCs/>
-                <w:color w:val="0D274D"/>
-                <w:sz w:val="21"/>
-                <w:szCs w:val="21"/>
-              </w:rPr>
-              <w:t xml:space="preserve">25 points per pain point → 100 per Case Study → 400 total.  </w:t>
-            </w:r>
-            <w:r>
-              <w:rPr>
-                <w:rFonts w:ascii="Calibri" w:cs="Calibri" w:eastAsia="Calibri" w:hAnsi="Calibri"/>
-                <w:color w:val="33465F"/>
-                <w:sz w:val="21"/>
-                <w:szCs w:val="21"/>
-              </w:rPr>
-              <w:t xml:space="preserve">Each answer is graded at one of three levels — marks reward an appropriate product and Solution-Engineer reasoning specific to Cedarline, not generic statements.</w:t>
-            </w:r>
-          </w:p>
-        </w:tc>
-      </w:tr>
-    </w:tbl>
-    <w:p>
-      <w:pPr>
-        <w:spacing w:after="120"/>
-      </w:pPr>
-      <w:r>
-        <w:rPr>
-          <w:rFonts w:ascii="Calibri" w:cs="Calibri" w:eastAsia="Calibri" w:hAnsi="Calibri"/>
-          <w:color w:val="14263A"/>
-          <w:sz w:val="2"/>
-          <w:szCs w:val="2"/>
-        </w:rPr>
-        <w:t xml:space="preserve"/>
+          <w:sz w:val="30"/>
+          <w:szCs w:val="30"/>
+        </w:rPr>
+        <w:t xml:space="preserve">How we evaluate — Good, Better, Best</w:t>
+      </w:r>
+    </w:p>
+    <w:p>
+      <w:pPr>
+        <w:spacing w:after="100" w:before="0" w:line="276"/>
+      </w:pPr>
+      <w:r>
+        <w:rPr>
+          <w:rFonts w:ascii="Calibri" w:cs="Calibri" w:eastAsia="Calibri" w:hAnsi="Calibri"/>
+          <w:color w:val="3A4C63"/>
+          <w:sz w:val="21"/>
+          <w:szCs w:val="21"/>
+        </w:rPr>
+        <w:t xml:space="preserve">Qualitative and encouraging — </w:t>
+      </w:r>
+      <w:r>
+        <w:rPr>
+          <w:rFonts w:ascii="Calibri" w:cs="Calibri" w:eastAsia="Calibri" w:hAnsi="Calibri"/>
+          <w:b/>
+          <w:bCs/>
+          <w:color w:val="0D274D"/>
+          <w:sz w:val="21"/>
+          <w:szCs w:val="21"/>
+        </w:rPr>
+        <w:t xml:space="preserve">no marks, no pass/fail</w:t>
+      </w:r>
+      <w:r>
+        <w:rPr>
+          <w:rFonts w:ascii="Calibri" w:cs="Calibri" w:eastAsia="Calibri" w:hAnsi="Calibri"/>
+          <w:color w:val="3A4C63"/>
+          <w:sz w:val="21"/>
+          <w:szCs w:val="21"/>
+        </w:rPr>
+        <w:t xml:space="preserve">. Every answer sits on a growth ladder; facilitators name the level and coach one step up.</w:t>
       </w:r>
     </w:p>
     <w:tbl>
@@ -764,42 +1197,50 @@
           <w:tcPr>
             <w:tcW w:type="dxa" w:w="3120"/>
             <w:tcBorders>
-              <w:top w:val="single" w:color="E2891F" w:sz="34"/>
+              <w:top w:val="single" w:color="2E9E6B" w:sz="40"/>
               <w:left w:val="single" w:color="C4D2E2" w:sz="6"/>
               <w:bottom w:val="single" w:color="C4D2E2" w:sz="6"/>
               <w:right w:val="single" w:color="C4D2E2" w:sz="6"/>
             </w:tcBorders>
             <w:tcMar>
-              <w:top w:type="dxa" w:w="110"/>
+              <w:top w:type="dxa" w:w="120"/>
               <w:left w:type="dxa" w:w="150"/>
-              <w:bottom w:type="dxa" w:w="110"/>
+              <w:bottom w:type="dxa" w:w="120"/>
               <w:right w:type="dxa" w:w="150"/>
             </w:tcMar>
             <w:vAlign w:val="top"/>
           </w:tcPr>
           <w:p>
             <w:pPr>
-              <w:spacing w:after="40" w:before="0" w:line="276"/>
-            </w:pPr>
-            <w:r>
-              <w:rPr>
-                <w:rFonts w:ascii="Calibri" w:cs="Calibri" w:eastAsia="Calibri" w:hAnsi="Calibri"/>
-                <w:b/>
-                <w:bCs/>
-                <w:color w:val="B4711A"/>
-                <w:sz w:val="20"/>
-                <w:szCs w:val="20"/>
-              </w:rPr>
-              <w:t xml:space="preserve">Associate</w:t>
-            </w:r>
-            <w:r>
-              <w:rPr>
-                <w:rFonts w:ascii="Calibri" w:cs="Calibri" w:eastAsia="Calibri" w:hAnsi="Calibri"/>
+              <w:spacing w:after="20" w:before="0" w:line="276"/>
+            </w:pPr>
+            <w:r>
+              <w:rPr>
+                <w:rFonts w:ascii="Calibri" w:cs="Calibri" w:eastAsia="Calibri" w:hAnsi="Calibri"/>
+                <w:b/>
+                <w:bCs/>
+                <w:color w:val="237A51"/>
+                <w:sz w:val="24"/>
+                <w:szCs w:val="24"/>
+              </w:rPr>
+              <w:t xml:space="preserve">🌱 Good</w:t>
+            </w:r>
+          </w:p>
+          <w:p>
+            <w:pPr>
+              <w:spacing w:after="60" w:before="0" w:line="276"/>
+            </w:pPr>
+            <w:r>
+              <w:rPr>
+                <w:rFonts w:ascii="Calibri" w:cs="Calibri" w:eastAsia="Calibri" w:hAnsi="Calibri"/>
+                <w:b/>
+                <w:bCs/>
+                <w:caps/>
                 <w:color w:val="7E8CA1"/>
                 <w:sz w:val="15"/>
                 <w:szCs w:val="15"/>
               </w:rPr>
-              <w:t xml:space="preserve">  6–13</w:t>
+              <w:t xml:space="preserve">Names the fit</w:t>
             </w:r>
           </w:p>
           <w:p>
@@ -813,7 +1254,7 @@
                 <w:sz w:val="18"/>
                 <w:szCs w:val="18"/>
               </w:rPr>
-              <w:t xml:space="preserve">Name the right product and show you understand the problem.</w:t>
+              <w:t xml:space="preserve">You put the right Cisco solution on the table and show you understand what the customer is actually worried about.</w:t>
             </w:r>
           </w:p>
         </w:tc>
@@ -821,42 +1262,50 @@
           <w:tcPr>
             <w:tcW w:type="dxa" w:w="3120"/>
             <w:tcBorders>
-              <w:top w:val="single" w:color="00BCEB" w:sz="34"/>
+              <w:top w:val="single" w:color="1273B8" w:sz="40"/>
               <w:left w:val="single" w:color="C4D2E2" w:sz="6"/>
               <w:bottom w:val="single" w:color="C4D2E2" w:sz="6"/>
               <w:right w:val="single" w:color="C4D2E2" w:sz="6"/>
             </w:tcBorders>
             <w:tcMar>
-              <w:top w:type="dxa" w:w="110"/>
+              <w:top w:type="dxa" w:w="120"/>
               <w:left w:type="dxa" w:w="150"/>
-              <w:bottom w:type="dxa" w:w="110"/>
+              <w:bottom w:type="dxa" w:w="120"/>
               <w:right w:type="dxa" w:w="150"/>
             </w:tcMar>
             <w:vAlign w:val="top"/>
           </w:tcPr>
           <w:p>
             <w:pPr>
-              <w:spacing w:after="40" w:before="0" w:line="276"/>
-            </w:pPr>
-            <w:r>
-              <w:rPr>
-                <w:rFonts w:ascii="Calibri" w:cs="Calibri" w:eastAsia="Calibri" w:hAnsi="Calibri"/>
-                <w:b/>
-                <w:bCs/>
-                <w:color w:val="036C8F"/>
-                <w:sz w:val="20"/>
-                <w:szCs w:val="20"/>
-              </w:rPr>
-              <w:t xml:space="preserve">Professional</w:t>
-            </w:r>
-            <w:r>
-              <w:rPr>
-                <w:rFonts w:ascii="Calibri" w:cs="Calibri" w:eastAsia="Calibri" w:hAnsi="Calibri"/>
+              <w:spacing w:after="20" w:before="0" w:line="276"/>
+            </w:pPr>
+            <w:r>
+              <w:rPr>
+                <w:rFonts w:ascii="Calibri" w:cs="Calibri" w:eastAsia="Calibri" w:hAnsi="Calibri"/>
+                <w:b/>
+                <w:bCs/>
+                <w:color w:val="0F5E96"/>
+                <w:sz w:val="24"/>
+                <w:szCs w:val="24"/>
+              </w:rPr>
+              <w:t xml:space="preserve">🔷 Better</w:t>
+            </w:r>
+          </w:p>
+          <w:p>
+            <w:pPr>
+              <w:spacing w:after="60" w:before="0" w:line="276"/>
+            </w:pPr>
+            <w:r>
+              <w:rPr>
+                <w:rFonts w:ascii="Calibri" w:cs="Calibri" w:eastAsia="Calibri" w:hAnsi="Calibri"/>
+                <w:b/>
+                <w:bCs/>
+                <w:caps/>
                 <w:color w:val="7E8CA1"/>
                 <w:sz w:val="15"/>
                 <w:szCs w:val="15"/>
               </w:rPr>
-              <w:t xml:space="preserve">  14–20</w:t>
+              <w:t xml:space="preserve">Explains the how</w:t>
             </w:r>
           </w:p>
           <w:p>
@@ -870,7 +1319,7 @@
                 <w:sz w:val="18"/>
                 <w:szCs w:val="18"/>
               </w:rPr>
-              <w:t xml:space="preserve">Also explain how the product addresses the concern.</w:t>
+              <w:t xml:space="preserve">You connect that solution to the concern — how it works and why it answers this specific problem — in language the customer would nod along to.</w:t>
             </w:r>
           </w:p>
         </w:tc>
@@ -878,42 +1327,50 @@
           <w:tcPr>
             <w:tcW w:type="dxa" w:w="3120"/>
             <w:tcBorders>
-              <w:top w:val="single" w:color="27A276" w:sz="34"/>
+              <w:top w:val="single" w:color="B7791F" w:sz="40"/>
               <w:left w:val="single" w:color="C4D2E2" w:sz="6"/>
               <w:bottom w:val="single" w:color="C4D2E2" w:sz="6"/>
               <w:right w:val="single" w:color="C4D2E2" w:sz="6"/>
             </w:tcBorders>
             <w:tcMar>
-              <w:top w:type="dxa" w:w="110"/>
+              <w:top w:type="dxa" w:w="120"/>
               <w:left w:type="dxa" w:w="150"/>
-              <w:bottom w:type="dxa" w:w="110"/>
+              <w:bottom w:type="dxa" w:w="120"/>
               <w:right w:type="dxa" w:w="150"/>
             </w:tcMar>
             <w:vAlign w:val="top"/>
           </w:tcPr>
           <w:p>
             <w:pPr>
-              <w:spacing w:after="40" w:before="0" w:line="276"/>
-            </w:pPr>
-            <w:r>
-              <w:rPr>
-                <w:rFonts w:ascii="Calibri" w:cs="Calibri" w:eastAsia="Calibri" w:hAnsi="Calibri"/>
-                <w:b/>
-                <w:bCs/>
-                <w:color w:val="1F8A63"/>
-                <w:sz w:val="20"/>
-                <w:szCs w:val="20"/>
-              </w:rPr>
-              <w:t xml:space="preserve">Expert</w:t>
-            </w:r>
-            <w:r>
-              <w:rPr>
-                <w:rFonts w:ascii="Calibri" w:cs="Calibri" w:eastAsia="Calibri" w:hAnsi="Calibri"/>
+              <w:spacing w:after="20" w:before="0" w:line="276"/>
+            </w:pPr>
+            <w:r>
+              <w:rPr>
+                <w:rFonts w:ascii="Calibri" w:cs="Calibri" w:eastAsia="Calibri" w:hAnsi="Calibri"/>
+                <w:b/>
+                <w:bCs/>
+                <w:color w:val="9A6516"/>
+                <w:sz w:val="24"/>
+                <w:szCs w:val="24"/>
+              </w:rPr>
+              <w:t xml:space="preserve">⭐ Best</w:t>
+            </w:r>
+          </w:p>
+          <w:p>
+            <w:pPr>
+              <w:spacing w:after="60" w:before="0" w:line="276"/>
+            </w:pPr>
+            <w:r>
+              <w:rPr>
+                <w:rFonts w:ascii="Calibri" w:cs="Calibri" w:eastAsia="Calibri" w:hAnsi="Calibri"/>
+                <w:b/>
+                <w:bCs/>
+                <w:caps/>
                 <w:color w:val="7E8CA1"/>
                 <w:sz w:val="15"/>
                 <w:szCs w:val="15"/>
               </w:rPr>
-              <w:t xml:space="preserve">  21–25</w:t>
+              <w:t xml:space="preserve">Sells the outcome</w:t>
             </w:r>
           </w:p>
           <w:p>
@@ -927,7 +1384,7 @@
                 <w:sz w:val="18"/>
                 <w:szCs w:val="18"/>
               </w:rPr>
-              <w:t xml:space="preserve">Also tie it to Cedarline's specifics and the outcome, and how it fits the wider HMF design.</w:t>
+              <w:t xml:space="preserve">You tie it to Cedarline's real constraints and the business outcome they care about, and you place it inside the bigger Hybrid Mesh Firewall story.</w:t>
             </w:r>
           </w:p>
         </w:tc>
@@ -944,7 +1401,47 @@
           <w:sz w:val="17"/>
           <w:szCs w:val="17"/>
         </w:rPr>
-        <w:t xml:space="preserve">Bands: Case Study /100 — Associate 40–64 · Professional 65–84 · Expert 85–100. Overall /400 — Associate 160–259 · Professional 260–339 · Expert 340–400. The proctor grades from the Proctor Guide and Proctor Grading Guide.</w:t>
+        <w:t xml:space="preserve">Facilitators grade from the </w:t>
+      </w:r>
+      <w:r>
+        <w:rPr>
+          <w:rFonts w:ascii="Calibri" w:cs="Calibri" w:eastAsia="Calibri" w:hAnsi="Calibri"/>
+          <w:b/>
+          <w:bCs/>
+          <w:color w:val="7E8CA1"/>
+          <w:sz w:val="17"/>
+          <w:szCs w:val="17"/>
+        </w:rPr>
+        <w:t xml:space="preserve">Solution Guide</w:t>
+      </w:r>
+      <w:r>
+        <w:rPr>
+          <w:rFonts w:ascii="Calibri" w:cs="Calibri" w:eastAsia="Calibri" w:hAnsi="Calibri"/>
+          <w:color w:val="7E8CA1"/>
+          <w:sz w:val="17"/>
+          <w:szCs w:val="17"/>
+        </w:rPr>
+        <w:t xml:space="preserve"> and record feedback on the </w:t>
+      </w:r>
+      <w:r>
+        <w:rPr>
+          <w:rFonts w:ascii="Calibri" w:cs="Calibri" w:eastAsia="Calibri" w:hAnsi="Calibri"/>
+          <w:b/>
+          <w:bCs/>
+          <w:color w:val="7E8CA1"/>
+          <w:sz w:val="17"/>
+          <w:szCs w:val="17"/>
+        </w:rPr>
+        <w:t xml:space="preserve">Grading Guide</w:t>
+      </w:r>
+      <w:r>
+        <w:rPr>
+          <w:rFonts w:ascii="Calibri" w:cs="Calibri" w:eastAsia="Calibri" w:hAnsi="Calibri"/>
+          <w:color w:val="7E8CA1"/>
+          <w:sz w:val="17"/>
+          <w:szCs w:val="17"/>
+        </w:rPr>
+        <w:t xml:space="preserve"> — strengths first, then one growth nudge per case study.</w:t>
       </w:r>
     </w:p>
     <w:sectPr>

</xml_diff>

<commit_message>
Revise pack: remove audience callouts, strip AI-style dashes, larger answer space, grammar pass
- Remove the target-audience reference callouts from all documents.
- Replace em/en dashes with clean punctuation throughout (content + templates);
  verified no dashes remain in rendered output or the docx text.
- Enlarge the team answer-submission space in the workbook.
- Grammar and consistency pass; align layout across all four documents.
- Regenerate PDF + Word and the package zip.
</commit_message>
<xml_diff>
--- a/case-study-pack/docx/HMF-Activity-Guide.docx
+++ b/case-study-pack/docx/HMF-Activity-Guide.docx
@@ -46,7 +46,7 @@
           <w:sz w:val="22"/>
           <w:szCs w:val="22"/>
         </w:rPr>
-        <w:t xml:space="preserve">Everything a facilitator needs to run the Cedarline HMF clinic.</w:t>
+        <w:t xml:space="preserve">Everything a facilitator needs to run the Cedarline HMF clinic, on one spread.</w:t>
       </w:r>
     </w:p>
     <w:p>
@@ -93,7 +93,7 @@
           <w:sz w:val="21"/>
           <w:szCs w:val="21"/>
         </w:rPr>
-        <w:t xml:space="preserve">Today your team is the Cisco Solution Engineering team walking into Cedarline. You'll sit with four real conversations, hear what's keeping them up at night, and answer as SEs do: the right solution, why it fits, and the outcome it delivers — pulled together into one Hybrid Mesh Firewall design.</w:t>
+        <w:t xml:space="preserve">Today your team is the Cisco Solution Engineering team walking into Cedarline. You will sit with four real conversations, hear what is keeping them up at night, and answer as Solution Engineers do, with the right solution, why it fits, and the outcome it delivers, all brought together into one Hybrid Mesh Firewall design.</w:t>
       </w:r>
     </w:p>
     <w:tbl>
@@ -152,7 +152,7 @@
                 <w:sz w:val="20"/>
                 <w:szCs w:val="20"/>
               </w:rPr>
-              <w:t xml:space="preserve">Cedarline Health Group is a regional healthcare payer-provider — roughly 8,000 employees across four hospitals and thirty-one clinics, plus a claims-processing business that handles the money. Growth by acquisition (including a second data centre absorbed as-is) and a mid-flight, disorderly move to public cloud have left a fragmented security posture. After a security incident in March, the board asked what would have stopped it — and leadership still cannot answer. Budget and executive attention are approved, but explicitly temporary, and the security team is small.</w:t>
+              <w:t xml:space="preserve">Cedarline Health Group is a regional healthcare payer-provider with roughly 8,000 employees across four hospitals and thirty-one clinics, plus a claims-processing business that handles the money. Growth by acquisition (including a second data centre absorbed as-is) and a mid-flight, disorderly move to public cloud have left a fragmented security posture. After a security incident in March, the board asked what would have stopped it, and leadership still cannot answer. Budget and executive attention are approved but explicitly temporary, and the security team is small.</w:t>
             </w:r>
           </w:p>
         </w:tc>
@@ -465,140 +465,7 @@
                 <w:sz w:val="21"/>
                 <w:szCs w:val="21"/>
               </w:rPr>
-              <w:t xml:space="preserve">Present the outcome — the business result — not just the feature.</w:t>
-            </w:r>
-          </w:p>
-        </w:tc>
-      </w:tr>
-    </w:tbl>
-    <w:p>
-      <w:pPr>
-        <w:spacing w:after="80" w:before="180" w:line="276"/>
-      </w:pPr>
-      <w:r>
-        <w:rPr>
-          <w:rFonts w:ascii="Calibri" w:cs="Calibri" w:eastAsia="Calibri" w:hAnsi="Calibri"/>
-          <w:b/>
-          <w:bCs/>
-          <w:color w:val="0D274D"/>
-          <w:sz w:val="30"/>
-          <w:szCs w:val="30"/>
-        </w:rPr>
-        <w:t xml:space="preserve">Built for every SE in the room</w:t>
-      </w:r>
-    </w:p>
-    <w:tbl>
-      <w:tblPr>
-        <w:tblW w:type="dxa" w:w="9360"/>
-        <w:tblBorders>
-          <w:top w:val="none" w:color="FFFFFF" w:sz="0"/>
-          <w:left w:val="none" w:color="FFFFFF" w:sz="0"/>
-          <w:bottom w:val="none" w:color="FFFFFF" w:sz="0"/>
-          <w:right w:val="none" w:color="FFFFFF" w:sz="0"/>
-          <w:insideH w:val="none" w:color="FFFFFF" w:sz="0"/>
-          <w:insideV w:val="single" w:color="FFFFFF" w:sz="60"/>
-        </w:tblBorders>
-      </w:tblPr>
-      <w:tblGrid>
-        <w:gridCol w:w="4680"/>
-        <w:gridCol w:w="4680"/>
-      </w:tblGrid>
-      <w:tr>
-        <w:tc>
-          <w:tcPr>
-            <w:tcW w:type="dxa" w:w="4680"/>
-            <w:tcBorders>
-              <w:top w:val="single" w:color="BEE6F2" w:sz="6"/>
-              <w:left w:val="single" w:color="BEE6F2" w:sz="6"/>
-              <w:bottom w:val="single" w:color="BEE6F2" w:sz="6"/>
-              <w:right w:val="single" w:color="BEE6F2" w:sz="6"/>
-            </w:tcBorders>
-            <w:shd w:fill="EAF7FB" w:color="auto" w:val="clear"/>
-            <w:tcMar>
-              <w:top w:type="dxa" w:w="110"/>
-              <w:left w:type="dxa" w:w="140"/>
-              <w:bottom w:type="dxa" w:w="110"/>
-              <w:right w:type="dxa" w:w="140"/>
-            </w:tcMar>
-          </w:tcPr>
-          <w:p>
-            <w:pPr>
-              <w:spacing w:after="50" w:before="0" w:line="276"/>
-            </w:pPr>
-            <w:r>
-              <w:rPr>
-                <w:rFonts w:ascii="Calibri" w:cs="Calibri" w:eastAsia="Calibri" w:hAnsi="Calibri"/>
-                <w:b/>
-                <w:bCs/>
-                <w:caps/>
-                <w:color w:val="0E6E90"/>
-                <w:sz w:val="16"/>
-                <w:szCs w:val="16"/>
-              </w:rPr>
-              <w:t xml:space="preserve">🧭 New to this area?</w:t>
-            </w:r>
-          </w:p>
-          <w:p>
-            <w:pPr>
-              <w:spacing w:after="0" w:before="0" w:line="276"/>
-            </w:pPr>
-            <w:r>
-              <w:rPr>
-                <w:rFonts w:ascii="Calibri" w:cs="Calibri" w:eastAsia="Calibri" w:hAnsi="Calibri"/>
-                <w:color w:val="134A5E"/>
-                <w:sz w:val="18"/>
-                <w:szCs w:val="18"/>
-              </w:rPr>
-              <w:t xml:space="preserve">Plain-language framing of what the customer is really asking — no security background assumed.</w:t>
-            </w:r>
-          </w:p>
-        </w:tc>
-        <w:tc>
-          <w:tcPr>
-            <w:tcW w:type="dxa" w:w="4680"/>
-            <w:tcBorders>
-              <w:top w:val="single" w:color="D6CBF0" w:sz="6"/>
-              <w:left w:val="single" w:color="D6CBF0" w:sz="6"/>
-              <w:bottom w:val="single" w:color="D6CBF0" w:sz="6"/>
-              <w:right w:val="single" w:color="D6CBF0" w:sz="6"/>
-            </w:tcBorders>
-            <w:shd w:fill="F1ECFA" w:color="auto" w:val="clear"/>
-            <w:tcMar>
-              <w:top w:type="dxa" w:w="110"/>
-              <w:left w:type="dxa" w:w="140"/>
-              <w:bottom w:type="dxa" w:w="110"/>
-              <w:right w:type="dxa" w:w="140"/>
-            </w:tcMar>
-          </w:tcPr>
-          <w:p>
-            <w:pPr>
-              <w:spacing w:after="50" w:before="0" w:line="276"/>
-            </w:pPr>
-            <w:r>
-              <w:rPr>
-                <w:rFonts w:ascii="Calibri" w:cs="Calibri" w:eastAsia="Calibri" w:hAnsi="Calibri"/>
-                <w:b/>
-                <w:bCs/>
-                <w:caps/>
-                <w:color w:val="5B3FBC"/>
-                <w:sz w:val="16"/>
-                <w:szCs w:val="16"/>
-              </w:rPr>
-              <w:t xml:space="preserve">🔐 For security specialists</w:t>
-            </w:r>
-          </w:p>
-          <w:p>
-            <w:pPr>
-              <w:spacing w:after="0" w:before="0" w:line="276"/>
-            </w:pPr>
-            <w:r>
-              <w:rPr>
-                <w:rFonts w:ascii="Calibri" w:cs="Calibri" w:eastAsia="Calibri" w:hAnsi="Calibri"/>
-                <w:color w:val="3E2E73"/>
-                <w:sz w:val="18"/>
-                <w:szCs w:val="18"/>
-              </w:rPr>
-              <w:t xml:space="preserve">The deeper technical angle and the specific Cisco capabilities in play.</w:t>
+              <w:t xml:space="preserve">Present the business outcome, not just the feature.</w:t>
             </w:r>
           </w:p>
         </w:tc>
@@ -701,7 +568,7 @@
                 <w:sz w:val="20"/>
                 <w:szCs w:val="20"/>
               </w:rPr>
-              <w:t xml:space="preserve">Case Study 1 — AI Security</w:t>
+              <w:t xml:space="preserve">Case Study 1 · AI Security</w:t>
             </w:r>
           </w:p>
           <w:p>
@@ -785,7 +652,7 @@
                 <w:sz w:val="20"/>
                 <w:szCs w:val="20"/>
               </w:rPr>
-              <w:t xml:space="preserve">Case Study 2 — Cloud Edge</w:t>
+              <w:t xml:space="preserve">Case Study 2 · Cloud Edge</w:t>
             </w:r>
           </w:p>
           <w:p>
@@ -869,7 +736,7 @@
                 <w:sz w:val="20"/>
                 <w:szCs w:val="20"/>
               </w:rPr>
-              <w:t xml:space="preserve">Case Study 3 — DC Edge · Perimeter Firewall</w:t>
+              <w:t xml:space="preserve">Case Study 3 · DC Edge · Perimeter Firewall</w:t>
             </w:r>
           </w:p>
           <w:p>
@@ -883,7 +750,7 @@
                 <w:sz w:val="18"/>
                 <w:szCs w:val="18"/>
               </w:rPr>
-              <w:t xml:space="preserve">A mixed-vendor perimeter, an inherited rulebase and mostly-encrypted traffic leave blind spots and slow response. Restore visibility, speed the response, and modernise detection with the team they have.</w:t>
+              <w:t xml:space="preserve">A mixed-vendor perimeter, an inherited rulebase and mostly encrypted traffic leave blind spots and a slow response. Restore visibility, speed the response, and modernise detection with the team they have.</w:t>
             </w:r>
           </w:p>
         </w:tc>
@@ -953,7 +820,7 @@
                 <w:sz w:val="20"/>
                 <w:szCs w:val="20"/>
               </w:rPr>
-              <w:t xml:space="preserve">Case Study 4 — Macro &amp; Micro Segmentation</w:t>
+              <w:t xml:space="preserve">Case Study 4 · Macro &amp; Micro Segmentation</w:t>
             </w:r>
           </w:p>
           <w:p>
@@ -967,7 +834,7 @@
                 <w:sz w:val="18"/>
                 <w:szCs w:val="18"/>
               </w:rPr>
-              <w:t xml:space="preserve">A flat data centre and fragmented Kubernetes networking invite east-west movement. Build segmentation Cedarline can adopt safely — with runtime visibility and application-dependency awareness so nothing breaks.</w:t>
+              <w:t xml:space="preserve">A flat data centre and fragmented Kubernetes networking invite east-west movement. Build segmentation Cedarline can adopt safely, with runtime visibility and application-dependency awareness so nothing breaks.</w:t>
             </w:r>
           </w:p>
         </w:tc>
@@ -1000,7 +867,7 @@
           <w:sz w:val="21"/>
           <w:szCs w:val="21"/>
         </w:rPr>
-        <w:t xml:space="preserve">•  Teams of 3–5, mixing specialists and generalists. Each team gets a </w:t>
+        <w:t xml:space="preserve">•  Teams of three to five. Each team gets a </w:t>
       </w:r>
       <w:r>
         <w:rPr>
@@ -1034,7 +901,7 @@
           <w:sz w:val="21"/>
           <w:szCs w:val="21"/>
         </w:rPr>
-        <w:t xml:space="preserve">•  Work all four case studies — four pain points each. For every one: the </w:t>
+        <w:t xml:space="preserve">•  Work all four case studies, four pain points each. For every one, give the </w:t>
       </w:r>
       <w:r>
         <w:rPr>
@@ -1045,7 +912,7 @@
           <w:sz w:val="21"/>
           <w:szCs w:val="21"/>
         </w:rPr>
-        <w:t xml:space="preserve">product/platform</w:t>
+        <w:t xml:space="preserve">product or platform</w:t>
       </w:r>
       <w:r>
         <w:rPr>
@@ -1054,7 +921,7 @@
           <w:sz w:val="21"/>
           <w:szCs w:val="21"/>
         </w:rPr>
-        <w:t xml:space="preserve"> and the SE response (how it addresses the concern and the outcome).</w:t>
+        <w:t xml:space="preserve"> and the SE response that covers how it addresses the concern and the outcome.</w:t>
       </w:r>
     </w:p>
     <w:p>
@@ -1088,7 +955,7 @@
           <w:sz w:val="21"/>
           <w:szCs w:val="21"/>
         </w:rPr>
-        <w:t xml:space="preserve"> — paste/draw it on the last page.</w:t>
+        <w:t xml:space="preserve">, pasted or drawn on the last page.</w:t>
       </w:r>
     </w:p>
     <w:p>
@@ -1102,7 +969,7 @@
           <w:sz w:val="21"/>
           <w:szCs w:val="21"/>
         </w:rPr>
-        <w:t xml:space="preserve">•  Suggested timing: ~10 min per case study, ~15 min for the topology and readout.</w:t>
+        <w:t xml:space="preserve">•  Suggested timing: about 10 minutes per case study, and about 15 minutes for the topology and readout.</w:t>
       </w:r>
       <w:r>
         <w:rPr>
@@ -1138,7 +1005,7 @@
           <w:sz w:val="30"/>
           <w:szCs w:val="30"/>
         </w:rPr>
-        <w:t xml:space="preserve">How we evaluate — Good, Better, Best</w:t>
+        <w:t xml:space="preserve">How we evaluate: Good, Better, Best</w:t>
       </w:r>
     </w:p>
     <w:p>
@@ -1152,7 +1019,7 @@
           <w:sz w:val="21"/>
           <w:szCs w:val="21"/>
         </w:rPr>
-        <w:t xml:space="preserve">Qualitative and encouraging — </w:t>
+        <w:t xml:space="preserve">Qualitative and encouraging, with </w:t>
       </w:r>
       <w:r>
         <w:rPr>
@@ -1163,7 +1030,7 @@
           <w:sz w:val="21"/>
           <w:szCs w:val="21"/>
         </w:rPr>
-        <w:t xml:space="preserve">no marks, no pass/fail</w:t>
+        <w:t xml:space="preserve">no marks and no pass or fail</w:t>
       </w:r>
       <w:r>
         <w:rPr>
@@ -1254,7 +1121,7 @@
                 <w:sz w:val="18"/>
                 <w:szCs w:val="18"/>
               </w:rPr>
-              <w:t xml:space="preserve">You put the right Cisco solution on the table and show you understand what the customer is actually worried about.</w:t>
+              <w:t xml:space="preserve">You put the right Cisco solution on the table and show that you understand what the customer is actually worried about.</w:t>
             </w:r>
           </w:p>
         </w:tc>
@@ -1319,7 +1186,7 @@
                 <w:sz w:val="18"/>
                 <w:szCs w:val="18"/>
               </w:rPr>
-              <w:t xml:space="preserve">You connect that solution to the concern — how it works and why it answers this specific problem — in language the customer would nod along to.</w:t>
+              <w:t xml:space="preserve">You connect that solution to the concern, showing how it works and why it answers this specific problem, in language the customer would nod along to.</w:t>
             </w:r>
           </w:p>
         </w:tc>
@@ -1441,7 +1308,7 @@
           <w:sz w:val="17"/>
           <w:szCs w:val="17"/>
         </w:rPr>
-        <w:t xml:space="preserve"> — strengths first, then one growth nudge per case study.</w:t>
+        <w:t xml:space="preserve">, strengths first, then one growth nudge per case study.</w:t>
       </w:r>
     </w:p>
     <w:sectPr>

</xml_diff>

<commit_message>
Switch grading to quantified three-dimension model (Problem Identifier / Solution Designer / Value Communicator)
Replace the qualitative Good/Better/Best ladder with a weighted, quantified
rubric: per pain point, Problem Identifier /5 + Solution Designer /10 +
Value Communicator /10 = 25, giving 100 per case study and 400 total.
- Grading Guide rebuilt as a scoring workbook: dimension band rubric,
  per-case scoring grids (PI/SD/VC/total), and a /400 summary table.
- Solution Guide maps each model answer to the three dimensions.
- Workbook and Activity Guide updated to explain the three dimensions.
- Dash-free and audience-free throughout; grammar pass; PDF + Word + zip.
</commit_message>
<xml_diff>
--- a/case-study-pack/docx/HMF-Activity-Guide.docx
+++ b/case-study-pack/docx/HMF-Activity-Guide.docx
@@ -1005,7 +1005,7 @@
           <w:sz w:val="30"/>
           <w:szCs w:val="30"/>
         </w:rPr>
-        <w:t xml:space="preserve">How we evaluate: Good, Better, Best</w:t>
+        <w:t xml:space="preserve">How we score</w:t>
       </w:r>
     </w:p>
     <w:p>
@@ -1019,7 +1019,7 @@
           <w:sz w:val="21"/>
           <w:szCs w:val="21"/>
         </w:rPr>
-        <w:t xml:space="preserve">Qualitative and encouraging, with </w:t>
+        <w:t xml:space="preserve">Every pain point is worth </w:t>
       </w:r>
       <w:r>
         <w:rPr>
@@ -1030,7 +1030,7 @@
           <w:sz w:val="21"/>
           <w:szCs w:val="21"/>
         </w:rPr>
-        <w:t xml:space="preserve">no marks and no pass or fail</w:t>
+        <w:t xml:space="preserve">25 points</w:t>
       </w:r>
       <w:r>
         <w:rPr>
@@ -1039,7 +1039,7 @@
           <w:sz w:val="21"/>
           <w:szCs w:val="21"/>
         </w:rPr>
-        <w:t xml:space="preserve">. Every answer sits on a growth ladder; facilitators name the level and coach one step up.</w:t>
+        <w:t xml:space="preserve"> across three dimensions, for 100 per case study and 400 in total.</w:t>
       </w:r>
     </w:p>
     <w:tbl>
@@ -1064,7 +1064,7 @@
           <w:tcPr>
             <w:tcW w:type="dxa" w:w="3120"/>
             <w:tcBorders>
-              <w:top w:val="single" w:color="2E9E6B" w:sz="40"/>
+              <w:top w:val="single" w:color="5B4BC4" w:sz="40"/>
               <w:left w:val="single" w:color="C4D2E2" w:sz="6"/>
               <w:bottom w:val="single" w:color="C4D2E2" w:sz="6"/>
               <w:right w:val="single" w:color="C4D2E2" w:sz="6"/>
@@ -1079,22 +1079,6 @@
           </w:tcPr>
           <w:p>
             <w:pPr>
-              <w:spacing w:after="20" w:before="0" w:line="276"/>
-            </w:pPr>
-            <w:r>
-              <w:rPr>
-                <w:rFonts w:ascii="Calibri" w:cs="Calibri" w:eastAsia="Calibri" w:hAnsi="Calibri"/>
-                <w:b/>
-                <w:bCs/>
-                <w:color w:val="237A51"/>
-                <w:sz w:val="24"/>
-                <w:szCs w:val="24"/>
-              </w:rPr>
-              <w:t xml:space="preserve">🌱 Good</w:t>
-            </w:r>
-          </w:p>
-          <w:p>
-            <w:pPr>
               <w:spacing w:after="60" w:before="0" w:line="276"/>
             </w:pPr>
             <w:r>
@@ -1102,12 +1086,22 @@
                 <w:rFonts w:ascii="Calibri" w:cs="Calibri" w:eastAsia="Calibri" w:hAnsi="Calibri"/>
                 <w:b/>
                 <w:bCs/>
-                <w:caps/>
+                <w:color w:val="4A3AA8"/>
+                <w:sz w:val="21"/>
+                <w:szCs w:val="21"/>
+              </w:rPr>
+              <w:t xml:space="preserve">🔍 Problem Identifier</w:t>
+            </w:r>
+            <w:r>
+              <w:rPr>
+                <w:rFonts w:ascii="Calibri" w:cs="Calibri" w:eastAsia="Calibri" w:hAnsi="Calibri"/>
+                <w:b/>
+                <w:bCs/>
                 <w:color w:val="7E8CA1"/>
-                <w:sz w:val="15"/>
-                <w:szCs w:val="15"/>
-              </w:rPr>
-              <w:t xml:space="preserve">Names the fit</w:t>
+                <w:sz w:val="16"/>
+                <w:szCs w:val="16"/>
+              </w:rPr>
+              <w:t xml:space="preserve">   / 5</w:t>
             </w:r>
           </w:p>
           <w:p>
@@ -1121,7 +1115,7 @@
                 <w:sz w:val="18"/>
                 <w:szCs w:val="18"/>
               </w:rPr>
-              <w:t xml:space="preserve">You put the right Cisco solution on the table and show that you understand what the customer is actually worried about.</w:t>
+              <w:t xml:space="preserve">Correctly identified the customer's pain point and the requirements behind it.</w:t>
             </w:r>
           </w:p>
         </w:tc>
@@ -1129,7 +1123,7 @@
           <w:tcPr>
             <w:tcW w:type="dxa" w:w="3120"/>
             <w:tcBorders>
-              <w:top w:val="single" w:color="1273B8" w:sz="40"/>
+              <w:top w:val="single" w:color="0E7C86" w:sz="40"/>
               <w:left w:val="single" w:color="C4D2E2" w:sz="6"/>
               <w:bottom w:val="single" w:color="C4D2E2" w:sz="6"/>
               <w:right w:val="single" w:color="C4D2E2" w:sz="6"/>
@@ -1144,22 +1138,6 @@
           </w:tcPr>
           <w:p>
             <w:pPr>
-              <w:spacing w:after="20" w:before="0" w:line="276"/>
-            </w:pPr>
-            <w:r>
-              <w:rPr>
-                <w:rFonts w:ascii="Calibri" w:cs="Calibri" w:eastAsia="Calibri" w:hAnsi="Calibri"/>
-                <w:b/>
-                <w:bCs/>
-                <w:color w:val="0F5E96"/>
-                <w:sz w:val="24"/>
-                <w:szCs w:val="24"/>
-              </w:rPr>
-              <w:t xml:space="preserve">🔷 Better</w:t>
-            </w:r>
-          </w:p>
-          <w:p>
-            <w:pPr>
               <w:spacing w:after="60" w:before="0" w:line="276"/>
             </w:pPr>
             <w:r>
@@ -1167,12 +1145,22 @@
                 <w:rFonts w:ascii="Calibri" w:cs="Calibri" w:eastAsia="Calibri" w:hAnsi="Calibri"/>
                 <w:b/>
                 <w:bCs/>
-                <w:caps/>
+                <w:color w:val="0B6670"/>
+                <w:sz w:val="21"/>
+                <w:szCs w:val="21"/>
+              </w:rPr>
+              <w:t xml:space="preserve">🏗️ Solution Designer</w:t>
+            </w:r>
+            <w:r>
+              <w:rPr>
+                <w:rFonts w:ascii="Calibri" w:cs="Calibri" w:eastAsia="Calibri" w:hAnsi="Calibri"/>
+                <w:b/>
+                <w:bCs/>
                 <w:color w:val="7E8CA1"/>
-                <w:sz w:val="15"/>
-                <w:szCs w:val="15"/>
-              </w:rPr>
-              <w:t xml:space="preserve">Explains the how</w:t>
+                <w:sz w:val="16"/>
+                <w:szCs w:val="16"/>
+              </w:rPr>
+              <w:t xml:space="preserve">   / 10</w:t>
             </w:r>
           </w:p>
           <w:p>
@@ -1186,7 +1174,7 @@
                 <w:sz w:val="18"/>
                 <w:szCs w:val="18"/>
               </w:rPr>
-              <w:t xml:space="preserve">You connect that solution to the concern, showing how it works and why it answers this specific problem, in language the customer would nod along to.</w:t>
+              <w:t xml:space="preserve">Recommended the right Cisco solution, architecture, and approach.</w:t>
             </w:r>
           </w:p>
         </w:tc>
@@ -1209,7 +1197,7 @@
           </w:tcPr>
           <w:p>
             <w:pPr>
-              <w:spacing w:after="20" w:before="0" w:line="276"/>
+              <w:spacing w:after="60" w:before="0" w:line="276"/>
             </w:pPr>
             <w:r>
               <w:rPr>
@@ -1217,27 +1205,21 @@
                 <w:b/>
                 <w:bCs/>
                 <w:color w:val="9A6516"/>
-                <w:sz w:val="24"/>
-                <w:szCs w:val="24"/>
-              </w:rPr>
-              <w:t xml:space="preserve">⭐ Best</w:t>
-            </w:r>
-          </w:p>
-          <w:p>
-            <w:pPr>
-              <w:spacing w:after="60" w:before="0" w:line="276"/>
-            </w:pPr>
-            <w:r>
-              <w:rPr>
-                <w:rFonts w:ascii="Calibri" w:cs="Calibri" w:eastAsia="Calibri" w:hAnsi="Calibri"/>
-                <w:b/>
-                <w:bCs/>
-                <w:caps/>
+                <w:sz w:val="21"/>
+                <w:szCs w:val="21"/>
+              </w:rPr>
+              <w:t xml:space="preserve">🎯 Value Communicator</w:t>
+            </w:r>
+            <w:r>
+              <w:rPr>
+                <w:rFonts w:ascii="Calibri" w:cs="Calibri" w:eastAsia="Calibri" w:hAnsi="Calibri"/>
+                <w:b/>
+                <w:bCs/>
                 <w:color w:val="7E8CA1"/>
-                <w:sz w:val="15"/>
-                <w:szCs w:val="15"/>
-              </w:rPr>
-              <w:t xml:space="preserve">Sells the outcome</w:t>
+                <w:sz w:val="16"/>
+                <w:szCs w:val="16"/>
+              </w:rPr>
+              <w:t xml:space="preserve">   / 10</w:t>
             </w:r>
           </w:p>
           <w:p>
@@ -1251,7 +1233,7 @@
                 <w:sz w:val="18"/>
                 <w:szCs w:val="18"/>
               </w:rPr>
-              <w:t xml:space="preserve">You tie it to Cedarline's real constraints and the business outcome they care about, and you place it inside the bigger Hybrid Mesh Firewall story.</w:t>
+              <w:t xml:space="preserve">Clearly explained how the solution works and the customer outcomes it enables.</w:t>
             </w:r>
           </w:p>
         </w:tc>
@@ -1288,7 +1270,7 @@
           <w:sz w:val="17"/>
           <w:szCs w:val="17"/>
         </w:rPr>
-        <w:t xml:space="preserve"> and record feedback on the </w:t>
+        <w:t xml:space="preserve"> and record marks and feedback on the </w:t>
       </w:r>
       <w:r>
         <w:rPr>
@@ -1308,7 +1290,7 @@
           <w:sz w:val="17"/>
           <w:szCs w:val="17"/>
         </w:rPr>
-        <w:t xml:space="preserve">, strengths first, then one growth nudge per case study.</w:t>
+        <w:t xml:space="preserve">.</w:t>
       </w:r>
     </w:p>
     <w:sectPr>

</xml_diff>

<commit_message>
Activity Guide: title as 'HMF Design Clinic Activity Guide'
</commit_message>
<xml_diff>
--- a/case-study-pack/docx/HMF-Activity-Guide.docx
+++ b/case-study-pack/docx/HMF-Activity-Guide.docx
@@ -16,7 +16,7 @@
           <w:sz w:val="16"/>
           <w:szCs w:val="16"/>
         </w:rPr>
-        <w:t xml:space="preserve">Cisco Secure · HMF Design Clinic</w:t>
+        <w:t xml:space="preserve">Cisco Secure · Facilitator resource</w:t>
       </w:r>
     </w:p>
     <w:p>
@@ -32,7 +32,7 @@
           <w:sz w:val="42"/>
           <w:szCs w:val="42"/>
         </w:rPr>
-        <w:t xml:space="preserve">Activity Guide</w:t>
+        <w:t xml:space="preserve">HMF Design Clinic Activity Guide</w:t>
       </w:r>
     </w:p>
     <w:p>

</xml_diff>

<commit_message>
Activity Guide: add 'The scenario' section; label case studies as Case Study 1-4 only
</commit_message>
<xml_diff>
--- a/case-study-pack/docx/HMF-Activity-Guide.docx
+++ b/case-study-pack/docx/HMF-Activity-Guide.docx
@@ -94,6 +94,22 @@
           <w:szCs w:val="21"/>
         </w:rPr>
         <w:t xml:space="preserve">Today your team is the Cisco Solution Engineering team walking into Cedarline. You will sit with four real conversations, hear what is keeping them up at night, and answer as Solution Engineers do, with the right solution, why it fits, and the outcome it delivers, all brought together into one Hybrid Mesh Firewall design.</w:t>
+      </w:r>
+    </w:p>
+    <w:p>
+      <w:pPr>
+        <w:spacing w:after="80" w:before="180" w:line="276"/>
+      </w:pPr>
+      <w:r>
+        <w:rPr>
+          <w:rFonts w:ascii="Calibri" w:cs="Calibri" w:eastAsia="Calibri" w:hAnsi="Calibri"/>
+          <w:b/>
+          <w:bCs/>
+          <w:color w:val="0D274D"/>
+          <w:sz w:val="30"/>
+          <w:szCs w:val="30"/>
+        </w:rPr>
+        <w:t xml:space="preserve">The scenario</w:t>
       </w:r>
     </w:p>
     <w:tbl>
@@ -134,17 +150,6 @@
             <w:pPr>
               <w:spacing w:after="0" w:before="0" w:line="276"/>
             </w:pPr>
-            <w:r>
-              <w:rPr>
-                <w:rFonts w:ascii="Calibri" w:cs="Calibri" w:eastAsia="Calibri" w:hAnsi="Calibri"/>
-                <w:b/>
-                <w:bCs/>
-                <w:color w:val="0D274D"/>
-                <w:sz w:val="20"/>
-                <w:szCs w:val="20"/>
-              </w:rPr>
-              <w:t xml:space="preserve">The customer.  </w:t>
-            </w:r>
             <w:r>
               <w:rPr>
                 <w:rFonts w:ascii="Calibri" w:cs="Calibri" w:eastAsia="Calibri" w:hAnsi="Calibri"/>
@@ -568,7 +573,7 @@
                 <w:sz w:val="20"/>
                 <w:szCs w:val="20"/>
               </w:rPr>
-              <w:t xml:space="preserve">Case Study 1 · AI Security</w:t>
+              <w:t xml:space="preserve">Case Study 1</w:t>
             </w:r>
           </w:p>
           <w:p>
@@ -652,7 +657,7 @@
                 <w:sz w:val="20"/>
                 <w:szCs w:val="20"/>
               </w:rPr>
-              <w:t xml:space="preserve">Case Study 2 · Cloud Edge</w:t>
+              <w:t xml:space="preserve">Case Study 2</w:t>
             </w:r>
           </w:p>
           <w:p>
@@ -736,7 +741,7 @@
                 <w:sz w:val="20"/>
                 <w:szCs w:val="20"/>
               </w:rPr>
-              <w:t xml:space="preserve">Case Study 3 · DC Edge · Perimeter Firewall</w:t>
+              <w:t xml:space="preserve">Case Study 3</w:t>
             </w:r>
           </w:p>
           <w:p>
@@ -820,7 +825,7 @@
                 <w:sz w:val="20"/>
                 <w:szCs w:val="20"/>
               </w:rPr>
-              <w:t xml:space="preserve">Case Study 4 · Macro &amp; Micro Segmentation</w:t>
+              <w:t xml:space="preserve">Case Study 4</w:t>
             </w:r>
           </w:p>
           <w:p>

</xml_diff>

<commit_message>
Activity Guide: teams of 8 per table; case-study + overall scoring with qualitative dimensions
</commit_message>
<xml_diff>
--- a/case-study-pack/docx/HMF-Activity-Guide.docx
+++ b/case-study-pack/docx/HMF-Activity-Guide.docx
@@ -872,7 +872,7 @@
           <w:sz w:val="21"/>
           <w:szCs w:val="21"/>
         </w:rPr>
-        <w:t xml:space="preserve">•  Teams of three to five. Each team gets a </w:t>
+        <w:t xml:space="preserve">•  Each table forms a </w:t>
       </w:r>
       <w:r>
         <w:rPr>
@@ -883,7 +883,7 @@
           <w:sz w:val="21"/>
           <w:szCs w:val="21"/>
         </w:rPr>
-        <w:t xml:space="preserve">Team Workbook</w:t>
+        <w:t xml:space="preserve">team of 8 members</w:t>
       </w:r>
       <w:r>
         <w:rPr>
@@ -892,7 +892,7 @@
           <w:sz w:val="21"/>
           <w:szCs w:val="21"/>
         </w:rPr>
-        <w:t xml:space="preserve">.</w:t>
+        <w:t xml:space="preserve"> who work through the clinic together. Each team gets a Team Workbook.</w:t>
       </w:r>
     </w:p>
     <w:p>
@@ -1024,7 +1024,7 @@
           <w:sz w:val="21"/>
           <w:szCs w:val="21"/>
         </w:rPr>
-        <w:t xml:space="preserve">Every pain point is worth </w:t>
+        <w:t xml:space="preserve">Each case study is scored across its </w:t>
       </w:r>
       <w:r>
         <w:rPr>
@@ -1035,7 +1035,7 @@
           <w:sz w:val="21"/>
           <w:szCs w:val="21"/>
         </w:rPr>
-        <w:t xml:space="preserve">25 points</w:t>
+        <w:t xml:space="preserve">four pain points</w:t>
       </w:r>
       <w:r>
         <w:rPr>
@@ -1044,7 +1044,67 @@
           <w:sz w:val="21"/>
           <w:szCs w:val="21"/>
         </w:rPr>
-        <w:t xml:space="preserve"> across three dimensions, for 100 per case study and 400 in total.</w:t>
+        <w:t xml:space="preserve">, giving a </w:t>
+      </w:r>
+      <w:r>
+        <w:rPr>
+          <w:rFonts w:ascii="Calibri" w:cs="Calibri" w:eastAsia="Calibri" w:hAnsi="Calibri"/>
+          <w:b/>
+          <w:bCs/>
+          <w:color w:val="0D274D"/>
+          <w:sz w:val="21"/>
+          <w:szCs w:val="21"/>
+        </w:rPr>
+        <w:t xml:space="preserve">case study score</w:t>
+      </w:r>
+      <w:r>
+        <w:rPr>
+          <w:rFonts w:ascii="Calibri" w:cs="Calibri" w:eastAsia="Calibri" w:hAnsi="Calibri"/>
+          <w:color w:val="3A4C63"/>
+          <w:sz w:val="21"/>
+          <w:szCs w:val="21"/>
+        </w:rPr>
+        <w:t xml:space="preserve"> and an </w:t>
+      </w:r>
+      <w:r>
+        <w:rPr>
+          <w:rFonts w:ascii="Calibri" w:cs="Calibri" w:eastAsia="Calibri" w:hAnsi="Calibri"/>
+          <w:b/>
+          <w:bCs/>
+          <w:color w:val="0D274D"/>
+          <w:sz w:val="21"/>
+          <w:szCs w:val="21"/>
+        </w:rPr>
+        <w:t xml:space="preserve">overall score</w:t>
+      </w:r>
+      <w:r>
+        <w:rPr>
+          <w:rFonts w:ascii="Calibri" w:cs="Calibri" w:eastAsia="Calibri" w:hAnsi="Calibri"/>
+          <w:color w:val="3A4C63"/>
+          <w:sz w:val="21"/>
+          <w:szCs w:val="21"/>
+        </w:rPr>
+        <w:t xml:space="preserve"> for the clinic. Alongside the score, the three dimensions below are provided as </w:t>
+      </w:r>
+      <w:r>
+        <w:rPr>
+          <w:rFonts w:ascii="Calibri" w:cs="Calibri" w:eastAsia="Calibri" w:hAnsi="Calibri"/>
+          <w:b/>
+          <w:bCs/>
+          <w:color w:val="0D274D"/>
+          <w:sz w:val="21"/>
+          <w:szCs w:val="21"/>
+        </w:rPr>
+        <w:t xml:space="preserve">qualitative feedback</w:t>
+      </w:r>
+      <w:r>
+        <w:rPr>
+          <w:rFonts w:ascii="Calibri" w:cs="Calibri" w:eastAsia="Calibri" w:hAnsi="Calibri"/>
+          <w:color w:val="3A4C63"/>
+          <w:sz w:val="21"/>
+          <w:szCs w:val="21"/>
+        </w:rPr>
+        <w:t xml:space="preserve"> on how the team performed.</w:t>
       </w:r>
     </w:p>
     <w:tbl>
@@ -1097,17 +1157,6 @@
               </w:rPr>
               <w:t xml:space="preserve">🔍 Problem Identifier</w:t>
             </w:r>
-            <w:r>
-              <w:rPr>
-                <w:rFonts w:ascii="Calibri" w:cs="Calibri" w:eastAsia="Calibri" w:hAnsi="Calibri"/>
-                <w:b/>
-                <w:bCs/>
-                <w:color w:val="7E8CA1"/>
-                <w:sz w:val="16"/>
-                <w:szCs w:val="16"/>
-              </w:rPr>
-              <w:t xml:space="preserve">   / 5</w:t>
-            </w:r>
           </w:p>
           <w:p>
             <w:pPr>
@@ -1156,17 +1205,6 @@
               </w:rPr>
               <w:t xml:space="preserve">🏗️ Solution Designer</w:t>
             </w:r>
-            <w:r>
-              <w:rPr>
-                <w:rFonts w:ascii="Calibri" w:cs="Calibri" w:eastAsia="Calibri" w:hAnsi="Calibri"/>
-                <w:b/>
-                <w:bCs/>
-                <w:color w:val="7E8CA1"/>
-                <w:sz w:val="16"/>
-                <w:szCs w:val="16"/>
-              </w:rPr>
-              <w:t xml:space="preserve">   / 10</w:t>
-            </w:r>
           </w:p>
           <w:p>
             <w:pPr>
@@ -1215,17 +1253,6 @@
               </w:rPr>
               <w:t xml:space="preserve">🎯 Value Communicator</w:t>
             </w:r>
-            <w:r>
-              <w:rPr>
-                <w:rFonts w:ascii="Calibri" w:cs="Calibri" w:eastAsia="Calibri" w:hAnsi="Calibri"/>
-                <w:b/>
-                <w:bCs/>
-                <w:color w:val="7E8CA1"/>
-                <w:sz w:val="16"/>
-                <w:szCs w:val="16"/>
-              </w:rPr>
-              <w:t xml:space="preserve">   / 10</w:t>
-            </w:r>
           </w:p>
           <w:p>
             <w:pPr>
@@ -1275,7 +1302,7 @@
           <w:sz w:val="17"/>
           <w:szCs w:val="17"/>
         </w:rPr>
-        <w:t xml:space="preserve"> and record marks and feedback on the </w:t>
+        <w:t xml:space="preserve"> and record scores and feedback on the </w:t>
       </w:r>
       <w:r>
         <w:rPr>

</xml_diff>

<commit_message>
Align all documents: teams of 8, Case Study 1-4 only, case-study/overall scoring with qualitative dimensions; remove all icons
- Apply the new model across Workbook, Solution Guide, Activity Guide, Grading Guide.
- Case studies referred to as Case Study 1-4 only (no topic names).
- Scoring: case study score out of 100, overall out of 400; the three
  dimensions are qualitative (Strong / Developing / Emerging), not numeric.
- Grading Guide rebuilt: per-case assessment table + case study score,
  summary table to 400, overall feedback.
- Remove all emoji icons for a professional look; dash-free; PDF + Word + zip.
</commit_message>
<xml_diff>
--- a/case-study-pack/docx/HMF-Activity-Guide.docx
+++ b/case-study-pack/docx/HMF-Activity-Guide.docx
@@ -205,7 +205,7 @@
               <w:bottom w:val="none" w:color="FFFFFF" w:sz="0"/>
               <w:right w:val="none" w:color="FFFFFF" w:sz="0"/>
             </w:tcBorders>
-            <w:shd w:fill="00BCEB" w:color="auto" w:val="clear"/>
+            <w:shd w:fill="0D274D" w:color="auto" w:val="clear"/>
             <w:tcMar>
               <w:top w:type="dxa" w:w="70"/>
               <w:left w:type="dxa" w:w="150"/>
@@ -224,7 +224,7 @@
                 <w:rFonts w:ascii="Calibri" w:cs="Calibri" w:eastAsia="Calibri" w:hAnsi="Calibri"/>
                 <w:b/>
                 <w:bCs/>
-                <w:color w:val="04283A"/>
+                <w:color w:val="FFFFFF"/>
                 <w:sz w:val="19"/>
                 <w:szCs w:val="19"/>
               </w:rPr>
@@ -275,7 +275,7 @@
               <w:bottom w:val="none" w:color="FFFFFF" w:sz="0"/>
               <w:right w:val="none" w:color="FFFFFF" w:sz="0"/>
             </w:tcBorders>
-            <w:shd w:fill="00BCEB" w:color="auto" w:val="clear"/>
+            <w:shd w:fill="0D274D" w:color="auto" w:val="clear"/>
             <w:tcMar>
               <w:top w:type="dxa" w:w="70"/>
               <w:left w:type="dxa" w:w="150"/>
@@ -294,7 +294,7 @@
                 <w:rFonts w:ascii="Calibri" w:cs="Calibri" w:eastAsia="Calibri" w:hAnsi="Calibri"/>
                 <w:b/>
                 <w:bCs/>
-                <w:color w:val="04283A"/>
+                <w:color w:val="FFFFFF"/>
                 <w:sz w:val="19"/>
                 <w:szCs w:val="19"/>
               </w:rPr>
@@ -345,7 +345,7 @@
               <w:bottom w:val="none" w:color="FFFFFF" w:sz="0"/>
               <w:right w:val="none" w:color="FFFFFF" w:sz="0"/>
             </w:tcBorders>
-            <w:shd w:fill="00BCEB" w:color="auto" w:val="clear"/>
+            <w:shd w:fill="0D274D" w:color="auto" w:val="clear"/>
             <w:tcMar>
               <w:top w:type="dxa" w:w="70"/>
               <w:left w:type="dxa" w:w="150"/>
@@ -364,7 +364,7 @@
                 <w:rFonts w:ascii="Calibri" w:cs="Calibri" w:eastAsia="Calibri" w:hAnsi="Calibri"/>
                 <w:b/>
                 <w:bCs/>
-                <w:color w:val="04283A"/>
+                <w:color w:val="FFFFFF"/>
                 <w:sz w:val="19"/>
                 <w:szCs w:val="19"/>
               </w:rPr>
@@ -415,7 +415,7 @@
               <w:bottom w:val="none" w:color="FFFFFF" w:sz="0"/>
               <w:right w:val="none" w:color="FFFFFF" w:sz="0"/>
             </w:tcBorders>
-            <w:shd w:fill="00BCEB" w:color="auto" w:val="clear"/>
+            <w:shd w:fill="0D274D" w:color="auto" w:val="clear"/>
             <w:tcMar>
               <w:top w:type="dxa" w:w="70"/>
               <w:left w:type="dxa" w:w="150"/>
@@ -434,7 +434,7 @@
                 <w:rFonts w:ascii="Calibri" w:cs="Calibri" w:eastAsia="Calibri" w:hAnsi="Calibri"/>
                 <w:b/>
                 <w:bCs/>
-                <w:color w:val="04283A"/>
+                <w:color w:val="FFFFFF"/>
                 <w:sz w:val="19"/>
                 <w:szCs w:val="19"/>
               </w:rPr>
@@ -1129,7 +1129,7 @@
           <w:tcPr>
             <w:tcW w:type="dxa" w:w="3120"/>
             <w:tcBorders>
-              <w:top w:val="single" w:color="5B4BC4" w:sz="40"/>
+              <w:top w:val="single" w:color="5B4BC4" w:sz="34"/>
               <w:left w:val="single" w:color="C4D2E2" w:sz="6"/>
               <w:bottom w:val="single" w:color="C4D2E2" w:sz="6"/>
               <w:right w:val="single" w:color="C4D2E2" w:sz="6"/>
@@ -1155,7 +1155,7 @@
                 <w:sz w:val="21"/>
                 <w:szCs w:val="21"/>
               </w:rPr>
-              <w:t xml:space="preserve">🔍 Problem Identifier</w:t>
+              <w:t xml:space="preserve">Problem Identifier</w:t>
             </w:r>
           </w:p>
           <w:p>
@@ -1177,7 +1177,7 @@
           <w:tcPr>
             <w:tcW w:type="dxa" w:w="3120"/>
             <w:tcBorders>
-              <w:top w:val="single" w:color="0E7C86" w:sz="40"/>
+              <w:top w:val="single" w:color="0E7C86" w:sz="34"/>
               <w:left w:val="single" w:color="C4D2E2" w:sz="6"/>
               <w:bottom w:val="single" w:color="C4D2E2" w:sz="6"/>
               <w:right w:val="single" w:color="C4D2E2" w:sz="6"/>
@@ -1203,7 +1203,7 @@
                 <w:sz w:val="21"/>
                 <w:szCs w:val="21"/>
               </w:rPr>
-              <w:t xml:space="preserve">🏗️ Solution Designer</w:t>
+              <w:t xml:space="preserve">Solution Designer</w:t>
             </w:r>
           </w:p>
           <w:p>
@@ -1225,7 +1225,7 @@
           <w:tcPr>
             <w:tcW w:type="dxa" w:w="3120"/>
             <w:tcBorders>
-              <w:top w:val="single" w:color="B7791F" w:sz="40"/>
+              <w:top w:val="single" w:color="B7791F" w:sz="34"/>
               <w:left w:val="single" w:color="C4D2E2" w:sz="6"/>
               <w:bottom w:val="single" w:color="C4D2E2" w:sz="6"/>
               <w:right w:val="single" w:color="C4D2E2" w:sz="6"/>
@@ -1251,7 +1251,7 @@
                 <w:sz w:val="21"/>
                 <w:szCs w:val="21"/>
               </w:rPr>
-              <w:t xml:space="preserve">🎯 Value Communicator</w:t>
+              <w:t xml:space="preserve">Value Communicator</w:t>
             </w:r>
           </w:p>
           <w:p>

</xml_diff>

<commit_message>
Integrate glossary into Workbook, add worked example/self-check/facilitation, SME-reviewed diagram, ratings-to-score map, per-pain-point Problem Identifier, clean product names, page numbers; 4 documents only
</commit_message>
<xml_diff>
--- a/case-study-pack/docx/HMF-Activity-Guide.docx
+++ b/case-study-pack/docx/HMF-Activity-Guide.docx
@@ -29,8 +29,8 @@
           <w:b/>
           <w:bCs/>
           <w:color w:val="0D274D"/>
-          <w:sz w:val="42"/>
-          <w:szCs w:val="42"/>
+          <w:sz w:val="40"/>
+          <w:szCs w:val="40"/>
         </w:rPr>
         <w:t xml:space="preserve">HMF Design Clinic Activity Guide</w:t>
       </w:r>
@@ -46,7 +46,7 @@
           <w:sz w:val="22"/>
           <w:szCs w:val="22"/>
         </w:rPr>
-        <w:t xml:space="preserve">Everything a facilitator needs to run the Cedarline HMF clinic, on one spread.</w:t>
+        <w:t xml:space="preserve">Everything a facilitator needs to run the Cedarline HMF clinic.</w:t>
       </w:r>
     </w:p>
     <w:p>
@@ -883,16 +883,16 @@
           <w:sz w:val="21"/>
           <w:szCs w:val="21"/>
         </w:rPr>
-        <w:t xml:space="preserve">team of 8 members</w:t>
-      </w:r>
-      <w:r>
-        <w:rPr>
-          <w:rFonts w:ascii="Calibri" w:cs="Calibri" w:eastAsia="Calibri" w:hAnsi="Calibri"/>
-          <w:color w:val="3A4C63"/>
-          <w:sz w:val="21"/>
-          <w:szCs w:val="21"/>
-        </w:rPr>
-        <w:t xml:space="preserve"> who work through the clinic together. Each team gets a Team Workbook.</w:t>
+        <w:t xml:space="preserve">team of 8</w:t>
+      </w:r>
+      <w:r>
+        <w:rPr>
+          <w:rFonts w:ascii="Calibri" w:cs="Calibri" w:eastAsia="Calibri" w:hAnsi="Calibri"/>
+          <w:color w:val="3A4C63"/>
+          <w:sz w:val="21"/>
+          <w:szCs w:val="21"/>
+        </w:rPr>
+        <w:t xml:space="preserve">. Give every team a Workbook.</w:t>
       </w:r>
     </w:p>
     <w:p>
@@ -960,7 +960,7 @@
           <w:sz w:val="21"/>
           <w:szCs w:val="21"/>
         </w:rPr>
-        <w:t xml:space="preserve">, pasted or drawn on the last page.</w:t>
+        <w:t xml:space="preserve">. Teams submit the diagram for SME review; it is reviewed, not scored.</w:t>
       </w:r>
     </w:p>
     <w:p>
@@ -974,27 +974,27 @@
           <w:sz w:val="21"/>
           <w:szCs w:val="21"/>
         </w:rPr>
-        <w:t xml:space="preserve">•  Suggested timing: about 10 minutes per case study, and about 15 minutes for the topology and readout.</w:t>
-      </w:r>
-      <w:r>
-        <w:rPr>
-          <w:rFonts w:ascii="Calibri" w:cs="Calibri" w:eastAsia="Calibri" w:hAnsi="Calibri"/>
-          <w:b/>
-          <w:bCs/>
-          <w:color w:val="0D274D"/>
-          <w:sz w:val="21"/>
-          <w:szCs w:val="21"/>
-        </w:rPr>
-        <w:t xml:space="preserve"/>
-      </w:r>
-      <w:r>
-        <w:rPr>
-          <w:rFonts w:ascii="Calibri" w:cs="Calibri" w:eastAsia="Calibri" w:hAnsi="Calibri"/>
-          <w:color w:val="3A4C63"/>
-          <w:sz w:val="21"/>
-          <w:szCs w:val="21"/>
-        </w:rPr>
-        <w:t xml:space="preserve"/>
+        <w:t xml:space="preserve">•  Suggested total: about </w:t>
+      </w:r>
+      <w:r>
+        <w:rPr>
+          <w:rFonts w:ascii="Calibri" w:cs="Calibri" w:eastAsia="Calibri" w:hAnsi="Calibri"/>
+          <w:b/>
+          <w:bCs/>
+          <w:color w:val="0D274D"/>
+          <w:sz w:val="21"/>
+          <w:szCs w:val="21"/>
+        </w:rPr>
+        <w:t xml:space="preserve">75 minutes</w:t>
+      </w:r>
+      <w:r>
+        <w:rPr>
+          <w:rFonts w:ascii="Calibri" w:cs="Calibri" w:eastAsia="Calibri" w:hAnsi="Calibri"/>
+          <w:color w:val="3A4C63"/>
+          <w:sz w:val="21"/>
+          <w:szCs w:val="21"/>
+        </w:rPr>
+        <w:t xml:space="preserve">, roughly 10 minutes per case study plus 15 minutes for the topology and readout.</w:t>
       </w:r>
     </w:p>
     <w:p>
@@ -1010,6 +1010,158 @@
           <w:sz w:val="30"/>
           <w:szCs w:val="30"/>
         </w:rPr>
+        <w:t xml:space="preserve">Facilitating a team of 8</w:t>
+      </w:r>
+    </w:p>
+    <w:p>
+      <w:pPr>
+        <w:spacing w:after="120" w:before="0" w:line="276"/>
+      </w:pPr>
+      <w:r>
+        <w:rPr>
+          <w:rFonts w:ascii="Calibri" w:cs="Calibri" w:eastAsia="Calibri" w:hAnsi="Calibri"/>
+          <w:color w:val="3A4C63"/>
+          <w:sz w:val="21"/>
+          <w:szCs w:val="21"/>
+        </w:rPr>
+        <w:t xml:space="preserve">•  Split the eight into </w:t>
+      </w:r>
+      <w:r>
+        <w:rPr>
+          <w:rFonts w:ascii="Calibri" w:cs="Calibri" w:eastAsia="Calibri" w:hAnsi="Calibri"/>
+          <w:b/>
+          <w:bCs/>
+          <w:color w:val="0D274D"/>
+          <w:sz w:val="21"/>
+          <w:szCs w:val="21"/>
+        </w:rPr>
+        <w:t xml:space="preserve">four pairs</w:t>
+      </w:r>
+      <w:r>
+        <w:rPr>
+          <w:rFonts w:ascii="Calibri" w:cs="Calibri" w:eastAsia="Calibri" w:hAnsi="Calibri"/>
+          <w:color w:val="3A4C63"/>
+          <w:sz w:val="21"/>
+          <w:szCs w:val="21"/>
+        </w:rPr>
+        <w:t xml:space="preserve">, one pair per case study, working in parallel, then reconvene so the whole team agrees each answer.</w:t>
+      </w:r>
+    </w:p>
+    <w:p>
+      <w:pPr>
+        <w:spacing w:after="120" w:before="0" w:line="276"/>
+      </w:pPr>
+      <w:r>
+        <w:rPr>
+          <w:rFonts w:ascii="Calibri" w:cs="Calibri" w:eastAsia="Calibri" w:hAnsi="Calibri"/>
+          <w:color w:val="3A4C63"/>
+          <w:sz w:val="21"/>
+          <w:szCs w:val="21"/>
+        </w:rPr>
+        <w:t xml:space="preserve">•  Assign light roles: a </w:t>
+      </w:r>
+      <w:r>
+        <w:rPr>
+          <w:rFonts w:ascii="Calibri" w:cs="Calibri" w:eastAsia="Calibri" w:hAnsi="Calibri"/>
+          <w:b/>
+          <w:bCs/>
+          <w:color w:val="0D274D"/>
+          <w:sz w:val="21"/>
+          <w:szCs w:val="21"/>
+        </w:rPr>
+        <w:t xml:space="preserve">timekeeper</w:t>
+      </w:r>
+      <w:r>
+        <w:rPr>
+          <w:rFonts w:ascii="Calibri" w:cs="Calibri" w:eastAsia="Calibri" w:hAnsi="Calibri"/>
+          <w:color w:val="3A4C63"/>
+          <w:sz w:val="21"/>
+          <w:szCs w:val="21"/>
+        </w:rPr>
+        <w:t xml:space="preserve">, a scribe for the workbook, and a presenter for the readout.</w:t>
+      </w:r>
+    </w:p>
+    <w:p>
+      <w:pPr>
+        <w:spacing w:after="120" w:before="0" w:line="276"/>
+      </w:pPr>
+      <w:r>
+        <w:rPr>
+          <w:rFonts w:ascii="Calibri" w:cs="Calibri" w:eastAsia="Calibri" w:hAnsi="Calibri"/>
+          <w:color w:val="3A4C63"/>
+          <w:sz w:val="21"/>
+          <w:szCs w:val="21"/>
+        </w:rPr>
+        <w:t xml:space="preserve">•  Bring the four case studies together as a team for the </w:t>
+      </w:r>
+      <w:r>
+        <w:rPr>
+          <w:rFonts w:ascii="Calibri" w:cs="Calibri" w:eastAsia="Calibri" w:hAnsi="Calibri"/>
+          <w:b/>
+          <w:bCs/>
+          <w:color w:val="0D274D"/>
+          <w:sz w:val="21"/>
+          <w:szCs w:val="21"/>
+        </w:rPr>
+        <w:t xml:space="preserve">topology</w:t>
+      </w:r>
+      <w:r>
+        <w:rPr>
+          <w:rFonts w:ascii="Calibri" w:cs="Calibri" w:eastAsia="Calibri" w:hAnsi="Calibri"/>
+          <w:color w:val="3A4C63"/>
+          <w:sz w:val="21"/>
+          <w:szCs w:val="21"/>
+        </w:rPr>
+        <w:t xml:space="preserve">, so everyone contributes to the single HMF design.</w:t>
+      </w:r>
+    </w:p>
+    <w:p>
+      <w:pPr>
+        <w:spacing w:after="120" w:before="0" w:line="276"/>
+      </w:pPr>
+      <w:r>
+        <w:rPr>
+          <w:rFonts w:ascii="Calibri" w:cs="Calibri" w:eastAsia="Calibri" w:hAnsi="Calibri"/>
+          <w:color w:val="3A4C63"/>
+          <w:sz w:val="21"/>
+          <w:szCs w:val="21"/>
+        </w:rPr>
+        <w:t xml:space="preserve">•  Keep the room moving with time checks at the end of each case study.</w:t>
+      </w:r>
+      <w:r>
+        <w:rPr>
+          <w:rFonts w:ascii="Calibri" w:cs="Calibri" w:eastAsia="Calibri" w:hAnsi="Calibri"/>
+          <w:b/>
+          <w:bCs/>
+          <w:color w:val="0D274D"/>
+          <w:sz w:val="21"/>
+          <w:szCs w:val="21"/>
+        </w:rPr>
+        <w:t xml:space="preserve"/>
+      </w:r>
+      <w:r>
+        <w:rPr>
+          <w:rFonts w:ascii="Calibri" w:cs="Calibri" w:eastAsia="Calibri" w:hAnsi="Calibri"/>
+          <w:color w:val="3A4C63"/>
+          <w:sz w:val="21"/>
+          <w:szCs w:val="21"/>
+        </w:rPr>
+        <w:t xml:space="preserve"/>
+      </w:r>
+    </w:p>
+    <w:p>
+      <w:pPr>
+        <w:spacing w:after="80" w:before="180" w:line="276"/>
+      </w:pPr>
+      <w:r>
+        <w:rPr>
+          <w:rFonts w:ascii="Calibri" w:cs="Calibri" w:eastAsia="Calibri" w:hAnsi="Calibri"/>
+          <w:b/>
+          <w:bCs/>
+          <w:color w:val="0D274D"/>
+          <w:sz w:val="30"/>
+          <w:szCs w:val="30"/>
+        </w:rPr>
         <w:t xml:space="preserve">How we score</w:t>
       </w:r>
     </w:p>
@@ -1084,7 +1236,7 @@
           <w:sz w:val="21"/>
           <w:szCs w:val="21"/>
         </w:rPr>
-        <w:t xml:space="preserve"> for the clinic. Alongside the score, the three dimensions below are provided as </w:t>
+        <w:t xml:space="preserve">. Alongside the score, the three dimensions below are provided as </w:t>
       </w:r>
       <w:r>
         <w:rPr>
@@ -1104,7 +1256,7 @@
           <w:sz w:val="21"/>
           <w:szCs w:val="21"/>
         </w:rPr>
-        <w:t xml:space="preserve"> on how the team performed.</w:t>
+        <w:t xml:space="preserve">. The topology diagram is submitted for SME review, not scored.</w:t>
       </w:r>
     </w:p>
     <w:tbl>
@@ -1326,6 +1478,7 @@
       </w:r>
     </w:p>
     <w:sectPr>
+      <w:footerReference w:type="default" r:id="rId7"/>
       <w:pgSz w:w="12240" w:h="15840" w:orient="portrait"/>
       <w:pgMar w:top="1440" w:right="1440" w:bottom="1440" w:left="1440" w:header="708" w:footer="708" w:gutter="0"/>
       <w:pgNumType/>
@@ -1374,6 +1527,59 @@
     </w:p>
   </w:endnote>
 </w:endnotes>
+</file>
+
+<file path=word/footer1.xml><?xml version="1.0" encoding="utf-8"?>
+<w:ftr xmlns:wpc="http://schemas.microsoft.com/office/word/2010/wordprocessingCanvas" xmlns:mc="http://schemas.openxmlformats.org/markup-compatibility/2006" xmlns:o="urn:schemas-microsoft-com:office:office" xmlns:r="http://schemas.openxmlformats.org/officeDocument/2006/relationships" xmlns:m="http://schemas.openxmlformats.org/officeDocument/2006/math" xmlns:v="urn:schemas-microsoft-com:vml" xmlns:wp14="http://schemas.microsoft.com/office/word/2010/wordprocessingDrawing" xmlns:wp="http://schemas.openxmlformats.org/drawingml/2006/wordprocessingDrawing" xmlns:w10="urn:schemas-microsoft-com:office:word" xmlns:w="http://schemas.openxmlformats.org/wordprocessingml/2006/main" xmlns:w14="http://schemas.microsoft.com/office/word/2010/wordml" xmlns:w15="http://schemas.microsoft.com/office/word/2012/wordml" xmlns:wpg="http://schemas.microsoft.com/office/word/2010/wordprocessingGroup" xmlns:wpi="http://schemas.microsoft.com/office/word/2010/wordprocessingInk" xmlns:wne="http://schemas.microsoft.com/office/word/2006/wordml" xmlns:wps="http://schemas.microsoft.com/office/word/2010/wordprocessingShape">
+  <w:p>
+    <w:pPr>
+      <w:spacing w:before="60"/>
+      <w:jc w:val="center"/>
+    </w:pPr>
+    <w:r>
+      <w:rPr>
+        <w:rFonts w:ascii="Calibri" w:cs="Calibri" w:eastAsia="Calibri" w:hAnsi="Calibri"/>
+        <w:color w:val="8091A4"/>
+        <w:sz w:val="15"/>
+        <w:szCs w:val="15"/>
+      </w:rPr>
+      <w:t xml:space="preserve">HMF Design Clinic  ·  Page </w:t>
+    </w:r>
+    <w:r>
+      <w:rPr>
+        <w:rFonts w:ascii="Calibri" w:cs="Calibri" w:eastAsia="Calibri" w:hAnsi="Calibri"/>
+        <w:color w:val="8091A4"/>
+        <w:sz w:val="15"/>
+        <w:szCs w:val="15"/>
+      </w:rPr>
+      <w:fldChar w:fldCharType="begin"/>
+      <w:instrText xml:space="preserve">PAGE</w:instrText>
+      <w:fldChar w:fldCharType="separate"/>
+      <w:fldChar w:fldCharType="end"/>
+    </w:r>
+    <w:r>
+      <w:rPr>
+        <w:rFonts w:ascii="Calibri" w:cs="Calibri" w:eastAsia="Calibri" w:hAnsi="Calibri"/>
+        <w:color w:val="8091A4"/>
+        <w:sz w:val="15"/>
+        <w:szCs w:val="15"/>
+      </w:rPr>
+      <w:t xml:space="preserve"> of </w:t>
+    </w:r>
+    <w:r>
+      <w:rPr>
+        <w:rFonts w:ascii="Calibri" w:cs="Calibri" w:eastAsia="Calibri" w:hAnsi="Calibri"/>
+        <w:color w:val="8091A4"/>
+        <w:sz w:val="15"/>
+        <w:szCs w:val="15"/>
+      </w:rPr>
+      <w:fldChar w:fldCharType="begin"/>
+      <w:instrText xml:space="preserve">NUMPAGES</w:instrText>
+      <w:fldChar w:fldCharType="separate"/>
+      <w:fldChar w:fldCharType="end"/>
+    </w:r>
+  </w:p>
+</w:ftr>
 </file>
 
 <file path=word/footnotes.xml><?xml version="1.0" encoding="utf-8"?>

</xml_diff>

<commit_message>
Grading Guide: add proctor evaluation guidance + per-pain-point answer breakdown; Workbook: add HMF product reference (pain point to product/platform/feature); cross-reference in Activity Guide
</commit_message>
<xml_diff>
--- a/case-study-pack/docx/HMF-Activity-Guide.docx
+++ b/case-study-pack/docx/HMF-Activity-Guide.docx
@@ -1434,7 +1434,7 @@
           <w:sz w:val="17"/>
           <w:szCs w:val="17"/>
         </w:rPr>
-        <w:t xml:space="preserve">Facilitators grade from the </w:t>
+        <w:t xml:space="preserve">Teams use the </w:t>
       </w:r>
       <w:r>
         <w:rPr>
@@ -1445,7 +1445,7 @@
           <w:sz w:val="17"/>
           <w:szCs w:val="17"/>
         </w:rPr>
-        <w:t xml:space="preserve">Solution Guide</w:t>
+        <w:t xml:space="preserve">HMF product reference</w:t>
       </w:r>
       <w:r>
         <w:rPr>
@@ -1454,7 +1454,7 @@
           <w:sz w:val="17"/>
           <w:szCs w:val="17"/>
         </w:rPr>
-        <w:t xml:space="preserve"> and record scores and feedback on the </w:t>
+        <w:t xml:space="preserve"> in the Workbook to identify the product for each pain point. Facilitators evaluate each Workbook against the </w:t>
       </w:r>
       <w:r>
         <w:rPr>
@@ -1474,7 +1474,7 @@
           <w:sz w:val="17"/>
           <w:szCs w:val="17"/>
         </w:rPr>
-        <w:t xml:space="preserve">.</w:t>
+        <w:t xml:space="preserve">, which breaks down the expected answer for every pain point, and record scores and feedback there.</w:t>
       </w:r>
     </w:p>
     <w:sectPr>

</xml_diff>

<commit_message>
Workbook: replace per-pain-point product reference with a uniform HMF product and feature list (no give-aways); participants identify products themselves
</commit_message>
<xml_diff>
--- a/case-study-pack/docx/HMF-Activity-Guide.docx
+++ b/case-study-pack/docx/HMF-Activity-Guide.docx
@@ -1445,7 +1445,7 @@
           <w:sz w:val="17"/>
           <w:szCs w:val="17"/>
         </w:rPr>
-        <w:t xml:space="preserve">HMF product reference</w:t>
+        <w:t xml:space="preserve">HMF product and feature reference</w:t>
       </w:r>
       <w:r>
         <w:rPr>
@@ -1454,7 +1454,7 @@
           <w:sz w:val="17"/>
           <w:szCs w:val="17"/>
         </w:rPr>
-        <w:t xml:space="preserve"> in the Workbook to identify the product for each pain point. Facilitators evaluate each Workbook against the </w:t>
+        <w:t xml:space="preserve"> in the Workbook to identify products themselves; it is a uniform list with no pain-point give-aways. Facilitators evaluate each Workbook against the </w:t>
       </w:r>
       <w:r>
         <w:rPr>

</xml_diff>

<commit_message>
Align timing to 40-45 minutes: parallel run model + agenda table in Activity Guide (replaces 75-min sequential)
</commit_message>
<xml_diff>
--- a/case-study-pack/docx/HMF-Activity-Guide.docx
+++ b/case-study-pack/docx/HMF-Activity-Guide.docx
@@ -858,7 +858,7 @@
           <w:sz w:val="30"/>
           <w:szCs w:val="30"/>
         </w:rPr>
-        <w:t xml:space="preserve">How to run it</w:t>
+        <w:t xml:space="preserve">How to run it (40 to 45 minutes)</w:t>
       </w:r>
     </w:p>
     <w:p>
@@ -892,7 +892,7 @@
           <w:sz w:val="21"/>
           <w:szCs w:val="21"/>
         </w:rPr>
-        <w:t xml:space="preserve">. Give every team a Workbook.</w:t>
+        <w:t xml:space="preserve">, split into four pairs. Give every team a Workbook.</w:t>
       </w:r>
     </w:p>
     <w:p>
@@ -906,7 +906,7 @@
           <w:sz w:val="21"/>
           <w:szCs w:val="21"/>
         </w:rPr>
-        <w:t xml:space="preserve">•  Work all four case studies, four pain points each. For every one, give the </w:t>
+        <w:t xml:space="preserve">•  Each pair takes </w:t>
       </w:r>
       <w:r>
         <w:rPr>
@@ -917,7 +917,7 @@
           <w:sz w:val="21"/>
           <w:szCs w:val="21"/>
         </w:rPr>
-        <w:t xml:space="preserve">product or platform</w:t>
+        <w:t xml:space="preserve">one case study</w:t>
       </w:r>
       <w:r>
         <w:rPr>
@@ -926,7 +926,7 @@
           <w:sz w:val="21"/>
           <w:szCs w:val="21"/>
         </w:rPr>
-        <w:t xml:space="preserve"> and the SE response that covers how it addresses the concern and the outcome.</w:t>
+        <w:t xml:space="preserve"> (its four pain points) and works in parallel: identify the product from the reference, then write the SE response.</w:t>
       </w:r>
     </w:p>
     <w:p>
@@ -940,7 +940,7 @@
           <w:sz w:val="21"/>
           <w:szCs w:val="21"/>
         </w:rPr>
-        <w:t xml:space="preserve">•  Finish by combining everything into one </w:t>
+        <w:t xml:space="preserve">•  The team reconvenes, each pair shares its case study, and the team </w:t>
       </w:r>
       <w:r>
         <w:rPr>
@@ -951,7 +951,7 @@
           <w:sz w:val="21"/>
           <w:szCs w:val="21"/>
         </w:rPr>
-        <w:t xml:space="preserve">Hybrid Mesh Firewall topology</w:t>
+        <w:t xml:space="preserve">agrees the answers</w:t>
       </w:r>
       <w:r>
         <w:rPr>
@@ -960,7 +960,7 @@
           <w:sz w:val="21"/>
           <w:szCs w:val="21"/>
         </w:rPr>
-        <w:t xml:space="preserve">. Teams submit the diagram for SME review; it is reviewed, not scored.</w:t>
+        <w:t xml:space="preserve">.</w:t>
       </w:r>
     </w:p>
     <w:p>
@@ -974,7 +974,7 @@
           <w:sz w:val="21"/>
           <w:szCs w:val="21"/>
         </w:rPr>
-        <w:t xml:space="preserve">•  Suggested total: about </w:t>
+        <w:t xml:space="preserve">•  Combine everything into one </w:t>
       </w:r>
       <w:r>
         <w:rPr>
@@ -985,7 +985,7 @@
           <w:sz w:val="21"/>
           <w:szCs w:val="21"/>
         </w:rPr>
-        <w:t xml:space="preserve">75 minutes</w:t>
+        <w:t xml:space="preserve">Hybrid Mesh Firewall topology</w:t>
       </w:r>
       <w:r>
         <w:rPr>
@@ -994,7 +994,7 @@
           <w:sz w:val="21"/>
           <w:szCs w:val="21"/>
         </w:rPr>
-        <w:t xml:space="preserve">, roughly 10 minutes per case study plus 15 minutes for the topology and readout.</w:t>
+        <w:t xml:space="preserve">. Teams submit the diagram for SME review; it is reviewed, not scored.</w:t>
       </w:r>
     </w:p>
     <w:p>
@@ -1010,143 +1010,362 @@
           <w:sz w:val="30"/>
           <w:szCs w:val="30"/>
         </w:rPr>
-        <w:t xml:space="preserve">Facilitating a team of 8</w:t>
-      </w:r>
-    </w:p>
-    <w:p>
-      <w:pPr>
-        <w:spacing w:after="120" w:before="0" w:line="276"/>
-      </w:pPr>
-      <w:r>
-        <w:rPr>
-          <w:rFonts w:ascii="Calibri" w:cs="Calibri" w:eastAsia="Calibri" w:hAnsi="Calibri"/>
-          <w:color w:val="3A4C63"/>
-          <w:sz w:val="21"/>
-          <w:szCs w:val="21"/>
-        </w:rPr>
-        <w:t xml:space="preserve">•  Split the eight into </w:t>
+        <w:t xml:space="preserve">Agenda</w:t>
+      </w:r>
+    </w:p>
+    <w:tbl>
+      <w:tblPr>
+        <w:tblW w:type="dxa" w:w="9360"/>
+        <w:tblBorders>
+          <w:top w:val="single" w:color="C4D2E2" w:sz="6"/>
+          <w:left w:val="single" w:color="C4D2E2" w:sz="6"/>
+          <w:bottom w:val="single" w:color="C4D2E2" w:sz="6"/>
+          <w:right w:val="single" w:color="C4D2E2" w:sz="6"/>
+          <w:insideH w:val="none" w:color="FFFFFF" w:sz="0"/>
+          <w:insideV w:val="none" w:color="FFFFFF" w:sz="0"/>
+        </w:tblBorders>
+      </w:tblPr>
+      <w:tblGrid>
+        <w:gridCol w:w="1600"/>
+        <w:gridCol w:w="7760"/>
+      </w:tblGrid>
+      <w:tr>
+        <w:tc>
+          <w:tcPr>
+            <w:tcW w:type="dxa" w:w="1600"/>
+            <w:tcBorders>
+              <w:top w:val="none" w:color="FFFFFF" w:sz="0"/>
+              <w:left w:val="none" w:color="FFFFFF" w:sz="0"/>
+              <w:bottom w:val="none" w:color="FFFFFF" w:sz="0"/>
+              <w:right w:val="none" w:color="FFFFFF" w:sz="0"/>
+            </w:tcBorders>
+            <w:tcMar>
+              <w:top w:type="dxa" w:w="80"/>
+              <w:left w:type="dxa" w:w="150"/>
+              <w:bottom w:type="dxa" w:w="80"/>
+              <w:right w:type="dxa" w:w="110"/>
+            </w:tcMar>
+          </w:tcPr>
+          <w:p>
+            <w:pPr>
+              <w:spacing w:after="0" w:before="0" w:line="276"/>
+            </w:pPr>
+            <w:r>
+              <w:rPr>
+                <w:rFonts w:ascii="Calibri" w:cs="Calibri" w:eastAsia="Calibri" w:hAnsi="Calibri"/>
+                <w:b/>
+                <w:bCs/>
+                <w:color w:val="0D274D"/>
+                <w:sz w:val="19"/>
+                <w:szCs w:val="19"/>
+              </w:rPr>
+              <w:t xml:space="preserve">0 to 5 min</w:t>
+            </w:r>
+          </w:p>
+        </w:tc>
+        <w:tc>
+          <w:tcPr>
+            <w:tcW w:type="dxa" w:w="7760"/>
+            <w:tcBorders>
+              <w:top w:val="none" w:color="FFFFFF" w:sz="0"/>
+              <w:left w:val="none" w:color="FFFFFF" w:sz="0"/>
+              <w:bottom w:val="none" w:color="FFFFFF" w:sz="0"/>
+              <w:right w:val="none" w:color="FFFFFF" w:sz="0"/>
+            </w:tcBorders>
+            <w:tcMar>
+              <w:top w:type="dxa" w:w="80"/>
+              <w:left w:type="dxa" w:w="140"/>
+              <w:bottom w:type="dxa" w:w="80"/>
+              <w:right w:type="dxa" w:w="140"/>
+            </w:tcMar>
+          </w:tcPr>
+          <w:p>
+            <w:pPr>
+              <w:spacing w:after="0" w:before="0" w:line="276"/>
+            </w:pPr>
+            <w:r>
+              <w:rPr>
+                <w:rFonts w:ascii="Calibri" w:cs="Calibri" w:eastAsia="Calibri" w:hAnsi="Calibri"/>
+                <w:color w:val="33465F"/>
+                <w:sz w:val="19"/>
+                <w:szCs w:val="19"/>
+              </w:rPr>
+              <w:t xml:space="preserve">Facilitator sets the scene: read the scenario, explain the mission and how scoring works. Teams skim the product reference.</w:t>
+            </w:r>
+          </w:p>
+        </w:tc>
+      </w:tr>
+      <w:tr>
+        <w:tc>
+          <w:tcPr>
+            <w:tcW w:type="dxa" w:w="1600"/>
+            <w:tcBorders>
+              <w:top w:val="single" w:color="E4EBF3" w:sz="4"/>
+              <w:left w:val="none" w:color="FFFFFF" w:sz="0"/>
+              <w:bottom w:val="none" w:color="FFFFFF" w:sz="0"/>
+              <w:right w:val="none" w:color="FFFFFF" w:sz="0"/>
+            </w:tcBorders>
+            <w:tcMar>
+              <w:top w:type="dxa" w:w="80"/>
+              <w:left w:type="dxa" w:w="150"/>
+              <w:bottom w:type="dxa" w:w="80"/>
+              <w:right w:type="dxa" w:w="110"/>
+            </w:tcMar>
+          </w:tcPr>
+          <w:p>
+            <w:pPr>
+              <w:spacing w:after="0" w:before="0" w:line="276"/>
+            </w:pPr>
+            <w:r>
+              <w:rPr>
+                <w:rFonts w:ascii="Calibri" w:cs="Calibri" w:eastAsia="Calibri" w:hAnsi="Calibri"/>
+                <w:b/>
+                <w:bCs/>
+                <w:color w:val="0D274D"/>
+                <w:sz w:val="19"/>
+                <w:szCs w:val="19"/>
+              </w:rPr>
+              <w:t xml:space="preserve">5 to 25 min</w:t>
+            </w:r>
+          </w:p>
+        </w:tc>
+        <w:tc>
+          <w:tcPr>
+            <w:tcW w:type="dxa" w:w="7760"/>
+            <w:tcBorders>
+              <w:top w:val="single" w:color="E4EBF3" w:sz="4"/>
+              <w:left w:val="none" w:color="FFFFFF" w:sz="0"/>
+              <w:bottom w:val="none" w:color="FFFFFF" w:sz="0"/>
+              <w:right w:val="none" w:color="FFFFFF" w:sz="0"/>
+            </w:tcBorders>
+            <w:tcMar>
+              <w:top w:type="dxa" w:w="80"/>
+              <w:left w:type="dxa" w:w="140"/>
+              <w:bottom w:type="dxa" w:w="80"/>
+              <w:right w:type="dxa" w:w="140"/>
+            </w:tcMar>
+          </w:tcPr>
+          <w:p>
+            <w:pPr>
+              <w:spacing w:after="0" w:before="0" w:line="276"/>
+            </w:pPr>
+            <w:r>
+              <w:rPr>
+                <w:rFonts w:ascii="Calibri" w:cs="Calibri" w:eastAsia="Calibri" w:hAnsi="Calibri"/>
+                <w:color w:val="33465F"/>
+                <w:sz w:val="19"/>
+                <w:szCs w:val="19"/>
+              </w:rPr>
+              <w:t xml:space="preserve">In four pairs, work one case study each (four pain points): identify the product, write the SE response.</w:t>
+            </w:r>
+          </w:p>
+        </w:tc>
+      </w:tr>
+      <w:tr>
+        <w:tc>
+          <w:tcPr>
+            <w:tcW w:type="dxa" w:w="1600"/>
+            <w:tcBorders>
+              <w:top w:val="single" w:color="E4EBF3" w:sz="4"/>
+              <w:left w:val="none" w:color="FFFFFF" w:sz="0"/>
+              <w:bottom w:val="none" w:color="FFFFFF" w:sz="0"/>
+              <w:right w:val="none" w:color="FFFFFF" w:sz="0"/>
+            </w:tcBorders>
+            <w:tcMar>
+              <w:top w:type="dxa" w:w="80"/>
+              <w:left w:type="dxa" w:w="150"/>
+              <w:bottom w:type="dxa" w:w="80"/>
+              <w:right w:type="dxa" w:w="110"/>
+            </w:tcMar>
+          </w:tcPr>
+          <w:p>
+            <w:pPr>
+              <w:spacing w:after="0" w:before="0" w:line="276"/>
+            </w:pPr>
+            <w:r>
+              <w:rPr>
+                <w:rFonts w:ascii="Calibri" w:cs="Calibri" w:eastAsia="Calibri" w:hAnsi="Calibri"/>
+                <w:b/>
+                <w:bCs/>
+                <w:color w:val="0D274D"/>
+                <w:sz w:val="19"/>
+                <w:szCs w:val="19"/>
+              </w:rPr>
+              <w:t xml:space="preserve">25 to 35 min</w:t>
+            </w:r>
+          </w:p>
+        </w:tc>
+        <w:tc>
+          <w:tcPr>
+            <w:tcW w:type="dxa" w:w="7760"/>
+            <w:tcBorders>
+              <w:top w:val="single" w:color="E4EBF3" w:sz="4"/>
+              <w:left w:val="none" w:color="FFFFFF" w:sz="0"/>
+              <w:bottom w:val="none" w:color="FFFFFF" w:sz="0"/>
+              <w:right w:val="none" w:color="FFFFFF" w:sz="0"/>
+            </w:tcBorders>
+            <w:tcMar>
+              <w:top w:type="dxa" w:w="80"/>
+              <w:left w:type="dxa" w:w="140"/>
+              <w:bottom w:type="dxa" w:w="80"/>
+              <w:right w:type="dxa" w:w="140"/>
+            </w:tcMar>
+          </w:tcPr>
+          <w:p>
+            <w:pPr>
+              <w:spacing w:after="0" w:before="0" w:line="276"/>
+            </w:pPr>
+            <w:r>
+              <w:rPr>
+                <w:rFonts w:ascii="Calibri" w:cs="Calibri" w:eastAsia="Calibri" w:hAnsi="Calibri"/>
+                <w:color w:val="33465F"/>
+                <w:sz w:val="19"/>
+                <w:szCs w:val="19"/>
+              </w:rPr>
+              <w:t xml:space="preserve">Reconvene. Each pair presents its case study; the team agrees and captures the answers.</w:t>
+            </w:r>
+          </w:p>
+        </w:tc>
+      </w:tr>
+      <w:tr>
+        <w:tc>
+          <w:tcPr>
+            <w:tcW w:type="dxa" w:w="1600"/>
+            <w:tcBorders>
+              <w:top w:val="single" w:color="E4EBF3" w:sz="4"/>
+              <w:left w:val="none" w:color="FFFFFF" w:sz="0"/>
+              <w:bottom w:val="none" w:color="FFFFFF" w:sz="0"/>
+              <w:right w:val="none" w:color="FFFFFF" w:sz="0"/>
+            </w:tcBorders>
+            <w:tcMar>
+              <w:top w:type="dxa" w:w="80"/>
+              <w:left w:type="dxa" w:w="150"/>
+              <w:bottom w:type="dxa" w:w="80"/>
+              <w:right w:type="dxa" w:w="110"/>
+            </w:tcMar>
+          </w:tcPr>
+          <w:p>
+            <w:pPr>
+              <w:spacing w:after="0" w:before="0" w:line="276"/>
+            </w:pPr>
+            <w:r>
+              <w:rPr>
+                <w:rFonts w:ascii="Calibri" w:cs="Calibri" w:eastAsia="Calibri" w:hAnsi="Calibri"/>
+                <w:b/>
+                <w:bCs/>
+                <w:color w:val="0D274D"/>
+                <w:sz w:val="19"/>
+                <w:szCs w:val="19"/>
+              </w:rPr>
+              <w:t xml:space="preserve">35 to 45 min</w:t>
+            </w:r>
+          </w:p>
+        </w:tc>
+        <w:tc>
+          <w:tcPr>
+            <w:tcW w:type="dxa" w:w="7760"/>
+            <w:tcBorders>
+              <w:top w:val="single" w:color="E4EBF3" w:sz="4"/>
+              <w:left w:val="none" w:color="FFFFFF" w:sz="0"/>
+              <w:bottom w:val="none" w:color="FFFFFF" w:sz="0"/>
+              <w:right w:val="none" w:color="FFFFFF" w:sz="0"/>
+            </w:tcBorders>
+            <w:tcMar>
+              <w:top w:type="dxa" w:w="80"/>
+              <w:left w:type="dxa" w:w="140"/>
+              <w:bottom w:type="dxa" w:w="80"/>
+              <w:right w:type="dxa" w:w="140"/>
+            </w:tcMar>
+          </w:tcPr>
+          <w:p>
+            <w:pPr>
+              <w:spacing w:after="0" w:before="0" w:line="276"/>
+            </w:pPr>
+            <w:r>
+              <w:rPr>
+                <w:rFonts w:ascii="Calibri" w:cs="Calibri" w:eastAsia="Calibri" w:hAnsi="Calibri"/>
+                <w:color w:val="33465F"/>
+                <w:sz w:val="19"/>
+                <w:szCs w:val="19"/>
+              </w:rPr>
+              <w:t xml:space="preserve">Combine into one HMF topology and prepare the readout.</w:t>
+            </w:r>
+          </w:p>
+        </w:tc>
+      </w:tr>
+    </w:tbl>
+    <w:p>
+      <w:pPr>
+        <w:spacing w:after="0" w:before="100" w:line="276"/>
+      </w:pPr>
+      <w:r>
+        <w:rPr>
+          <w:rFonts w:ascii="Calibri" w:cs="Calibri" w:eastAsia="Calibri" w:hAnsi="Calibri"/>
+          <w:color w:val="7E8CA1"/>
+          <w:sz w:val="17"/>
+          <w:szCs w:val="17"/>
+        </w:rPr>
+        <w:t xml:space="preserve">Assign light roles in each team: a </w:t>
       </w:r>
       <w:r>
         <w:rPr>
           <w:rFonts w:ascii="Calibri" w:cs="Calibri" w:eastAsia="Calibri" w:hAnsi="Calibri"/>
           <w:b/>
           <w:bCs/>
-          <w:color w:val="0D274D"/>
-          <w:sz w:val="21"/>
-          <w:szCs w:val="21"/>
-        </w:rPr>
-        <w:t xml:space="preserve">four pairs</w:t>
-      </w:r>
-      <w:r>
-        <w:rPr>
-          <w:rFonts w:ascii="Calibri" w:cs="Calibri" w:eastAsia="Calibri" w:hAnsi="Calibri"/>
-          <w:color w:val="3A4C63"/>
-          <w:sz w:val="21"/>
-          <w:szCs w:val="21"/>
-        </w:rPr>
-        <w:t xml:space="preserve">, one pair per case study, working in parallel, then reconvene so the whole team agrees each answer.</w:t>
-      </w:r>
-    </w:p>
-    <w:p>
-      <w:pPr>
-        <w:spacing w:after="120" w:before="0" w:line="276"/>
-      </w:pPr>
-      <w:r>
-        <w:rPr>
-          <w:rFonts w:ascii="Calibri" w:cs="Calibri" w:eastAsia="Calibri" w:hAnsi="Calibri"/>
-          <w:color w:val="3A4C63"/>
-          <w:sz w:val="21"/>
-          <w:szCs w:val="21"/>
-        </w:rPr>
-        <w:t xml:space="preserve">•  Assign light roles: a </w:t>
+          <w:color w:val="7E8CA1"/>
+          <w:sz w:val="17"/>
+          <w:szCs w:val="17"/>
+        </w:rPr>
+        <w:t xml:space="preserve">timekeeper</w:t>
+      </w:r>
+      <w:r>
+        <w:rPr>
+          <w:rFonts w:ascii="Calibri" w:cs="Calibri" w:eastAsia="Calibri" w:hAnsi="Calibri"/>
+          <w:color w:val="7E8CA1"/>
+          <w:sz w:val="17"/>
+          <w:szCs w:val="17"/>
+        </w:rPr>
+        <w:t xml:space="preserve">, a </w:t>
       </w:r>
       <w:r>
         <w:rPr>
           <w:rFonts w:ascii="Calibri" w:cs="Calibri" w:eastAsia="Calibri" w:hAnsi="Calibri"/>
           <w:b/>
           <w:bCs/>
-          <w:color w:val="0D274D"/>
-          <w:sz w:val="21"/>
-          <w:szCs w:val="21"/>
-        </w:rPr>
-        <w:t xml:space="preserve">timekeeper</w:t>
-      </w:r>
-      <w:r>
-        <w:rPr>
-          <w:rFonts w:ascii="Calibri" w:cs="Calibri" w:eastAsia="Calibri" w:hAnsi="Calibri"/>
-          <w:color w:val="3A4C63"/>
-          <w:sz w:val="21"/>
-          <w:szCs w:val="21"/>
-        </w:rPr>
-        <w:t xml:space="preserve">, a scribe for the workbook, and a presenter for the readout.</w:t>
-      </w:r>
-    </w:p>
-    <w:p>
-      <w:pPr>
-        <w:spacing w:after="120" w:before="0" w:line="276"/>
-      </w:pPr>
-      <w:r>
-        <w:rPr>
-          <w:rFonts w:ascii="Calibri" w:cs="Calibri" w:eastAsia="Calibri" w:hAnsi="Calibri"/>
-          <w:color w:val="3A4C63"/>
-          <w:sz w:val="21"/>
-          <w:szCs w:val="21"/>
-        </w:rPr>
-        <w:t xml:space="preserve">•  Bring the four case studies together as a team for the </w:t>
+          <w:color w:val="7E8CA1"/>
+          <w:sz w:val="17"/>
+          <w:szCs w:val="17"/>
+        </w:rPr>
+        <w:t xml:space="preserve">scribe</w:t>
+      </w:r>
+      <w:r>
+        <w:rPr>
+          <w:rFonts w:ascii="Calibri" w:cs="Calibri" w:eastAsia="Calibri" w:hAnsi="Calibri"/>
+          <w:color w:val="7E8CA1"/>
+          <w:sz w:val="17"/>
+          <w:szCs w:val="17"/>
+        </w:rPr>
+        <w:t xml:space="preserve"> for the Workbook, and a </w:t>
       </w:r>
       <w:r>
         <w:rPr>
           <w:rFonts w:ascii="Calibri" w:cs="Calibri" w:eastAsia="Calibri" w:hAnsi="Calibri"/>
           <w:b/>
           <w:bCs/>
-          <w:color w:val="0D274D"/>
-          <w:sz w:val="21"/>
-          <w:szCs w:val="21"/>
-        </w:rPr>
-        <w:t xml:space="preserve">topology</w:t>
-      </w:r>
-      <w:r>
-        <w:rPr>
-          <w:rFonts w:ascii="Calibri" w:cs="Calibri" w:eastAsia="Calibri" w:hAnsi="Calibri"/>
-          <w:color w:val="3A4C63"/>
-          <w:sz w:val="21"/>
-          <w:szCs w:val="21"/>
-        </w:rPr>
-        <w:t xml:space="preserve">, so everyone contributes to the single HMF design.</w:t>
-      </w:r>
-    </w:p>
-    <w:p>
-      <w:pPr>
-        <w:spacing w:after="120" w:before="0" w:line="276"/>
-      </w:pPr>
-      <w:r>
-        <w:rPr>
-          <w:rFonts w:ascii="Calibri" w:cs="Calibri" w:eastAsia="Calibri" w:hAnsi="Calibri"/>
-          <w:color w:val="3A4C63"/>
-          <w:sz w:val="21"/>
-          <w:szCs w:val="21"/>
-        </w:rPr>
-        <w:t xml:space="preserve">•  Keep the room moving with time checks at the end of each case study.</w:t>
-      </w:r>
-      <w:r>
-        <w:rPr>
-          <w:rFonts w:ascii="Calibri" w:cs="Calibri" w:eastAsia="Calibri" w:hAnsi="Calibri"/>
-          <w:b/>
-          <w:bCs/>
-          <w:color w:val="0D274D"/>
-          <w:sz w:val="21"/>
-          <w:szCs w:val="21"/>
-        </w:rPr>
-        <w:t xml:space="preserve"/>
-      </w:r>
-      <w:r>
-        <w:rPr>
-          <w:rFonts w:ascii="Calibri" w:cs="Calibri" w:eastAsia="Calibri" w:hAnsi="Calibri"/>
-          <w:color w:val="3A4C63"/>
-          <w:sz w:val="21"/>
-          <w:szCs w:val="21"/>
-        </w:rPr>
-        <w:t xml:space="preserve"/>
+          <w:color w:val="7E8CA1"/>
+          <w:sz w:val="17"/>
+          <w:szCs w:val="17"/>
+        </w:rPr>
+        <w:t xml:space="preserve">presenter</w:t>
+      </w:r>
+      <w:r>
+        <w:rPr>
+          <w:rFonts w:ascii="Calibri" w:cs="Calibri" w:eastAsia="Calibri" w:hAnsi="Calibri"/>
+          <w:color w:val="7E8CA1"/>
+          <w:sz w:val="17"/>
+          <w:szCs w:val="17"/>
+        </w:rPr>
+        <w:t xml:space="preserve"> for the readout. Keep the room moving with a time check at 25 and 35 minutes.</w:t>
       </w:r>
     </w:p>
     <w:p>

</xml_diff>

<commit_message>
Add single-page Proctor evaluation sheet to the Workbook; align scoring across all documents
Each submitted Workbook now ends with a Proctor evaluation page:
team name and members, a score out of 100 with feedback for each
case study, an overall score out of 400, an SME-review line for the
topology, and what the team did well and where they can learn and grow.

The Grading Guide summary uses the identical page, its proctor steps
now point to recording on that page, and the Activity Guide's scoring
note references it. README and package zip refreshed.

Co-Authored-By: Claude Opus 4.8 <noreply@anthropic.com>
Claude-Session: https://claude.ai/code/session_01QFagQxWq3DUNgqxaEaNjHo
</commit_message>
<xml_diff>
--- a/case-study-pack/docx/HMF-Activity-Guide.docx
+++ b/case-study-pack/docx/HMF-Activity-Guide.docx
@@ -1664,7 +1664,7 @@
           <w:sz w:val="17"/>
           <w:szCs w:val="17"/>
         </w:rPr>
-        <w:t xml:space="preserve">HMF product and feature reference</w:t>
+        <w:t xml:space="preserve">HMF product cheat-strip</w:t>
       </w:r>
       <w:r>
         <w:rPr>
@@ -1673,7 +1673,7 @@
           <w:sz w:val="17"/>
           <w:szCs w:val="17"/>
         </w:rPr>
-        <w:t xml:space="preserve"> in the Workbook to identify products themselves; it is a uniform list with no pain-point give-aways. Facilitators evaluate each Workbook against the </w:t>
+        <w:t xml:space="preserve"> in the Workbook to identify products themselves; it is a uniform list with no pain-point give-aways. Facilitators evaluate each submitted Workbook against the </w:t>
       </w:r>
       <w:r>
         <w:rPr>
@@ -1693,7 +1693,27 @@
           <w:sz w:val="17"/>
           <w:szCs w:val="17"/>
         </w:rPr>
-        <w:t xml:space="preserve">, which breaks down the expected answer for every pain point, and record scores and feedback there.</w:t>
+        <w:t xml:space="preserve">, which breaks down the expected answer for every pain point, and record the score and feedback on the </w:t>
+      </w:r>
+      <w:r>
+        <w:rPr>
+          <w:rFonts w:ascii="Calibri" w:cs="Calibri" w:eastAsia="Calibri" w:hAnsi="Calibri"/>
+          <w:b/>
+          <w:bCs/>
+          <w:color w:val="7E8CA1"/>
+          <w:sz w:val="17"/>
+          <w:szCs w:val="17"/>
+        </w:rPr>
+        <w:t xml:space="preserve">Proctor evaluation page</w:t>
+      </w:r>
+      <w:r>
+        <w:rPr>
+          <w:rFonts w:ascii="Calibri" w:cs="Calibri" w:eastAsia="Calibri" w:hAnsi="Calibri"/>
+          <w:color w:val="7E8CA1"/>
+          <w:sz w:val="17"/>
+          <w:szCs w:val="17"/>
+        </w:rPr>
+        <w:t xml:space="preserve"> bound into the back of that team's Workbook: a score out of 100 with feedback for each case study, an overall score out of 400, and a note on what the team did well and where they can learn and grow.</w:t>
       </w:r>
     </w:p>
     <w:sectPr>

</xml_diff>

<commit_message>
Rebuild Grading Guide as a scoring instrument: rubric + per-pain-point scoring
The Grading Guide now scores each submitted Workbook pain point by pain
point against an explicit rubric:
- A rubric page: the three dimensions with their weights (Problem
  Identifier 5, Solution Designer 10, Value Communicator 10 = 25 per
  pain point) and the score-band descriptors for each, so a proctor can
  match a written answer to a score.
- Per pain point: the full-credit answer for each dimension plus a score
  box (/5, /10, /10) and a pain-point total /25; four pain points tally
  to the case study score /100; four case studies to /400.
- Updated proctor steps and the "how to award marks" guidance.

Activity Guide and Workbook scoring notes aligned to the points model.
The Solution Guide is unchanged. README and package zip refreshed.

Co-Authored-By: Claude Opus 4.8 <noreply@anthropic.com>
Claude-Session: https://claude.ai/code/session_01QFagQxWq3DUNgqxaEaNjHo
</commit_message>
<xml_diff>
--- a/case-study-pack/docx/HMF-Activity-Guide.docx
+++ b/case-study-pack/docx/HMF-Activity-Guide.docx
@@ -1395,7 +1395,7 @@
           <w:sz w:val="21"/>
           <w:szCs w:val="21"/>
         </w:rPr>
-        <w:t xml:space="preserve">Each case study is scored across its </w:t>
+        <w:t xml:space="preserve">Each pain point is scored across the three dimensions below: </w:t>
       </w:r>
       <w:r>
         <w:rPr>
@@ -1406,7 +1406,7 @@
           <w:sz w:val="21"/>
           <w:szCs w:val="21"/>
         </w:rPr>
-        <w:t xml:space="preserve">four pain points</w:t>
+        <w:t xml:space="preserve">Problem Identifier</w:t>
       </w:r>
       <w:r>
         <w:rPr>
@@ -1415,7 +1415,7 @@
           <w:sz w:val="21"/>
           <w:szCs w:val="21"/>
         </w:rPr>
-        <w:t xml:space="preserve">, giving a </w:t>
+        <w:t xml:space="preserve"> out of 5, </w:t>
       </w:r>
       <w:r>
         <w:rPr>
@@ -1426,7 +1426,7 @@
           <w:sz w:val="21"/>
           <w:szCs w:val="21"/>
         </w:rPr>
-        <w:t xml:space="preserve">case study score</w:t>
+        <w:t xml:space="preserve">Solution Designer</w:t>
       </w:r>
       <w:r>
         <w:rPr>
@@ -1435,7 +1435,7 @@
           <w:sz w:val="21"/>
           <w:szCs w:val="21"/>
         </w:rPr>
-        <w:t xml:space="preserve"> and an </w:t>
+        <w:t xml:space="preserve"> out of 10, and </w:t>
       </w:r>
       <w:r>
         <w:rPr>
@@ -1446,7 +1446,7 @@
           <w:sz w:val="21"/>
           <w:szCs w:val="21"/>
         </w:rPr>
-        <w:t xml:space="preserve">overall score</w:t>
+        <w:t xml:space="preserve">Value Communicator</w:t>
       </w:r>
       <w:r>
         <w:rPr>
@@ -1455,7 +1455,7 @@
           <w:sz w:val="21"/>
           <w:szCs w:val="21"/>
         </w:rPr>
-        <w:t xml:space="preserve">. Alongside the score, the three dimensions below are provided as </w:t>
+        <w:t xml:space="preserve"> out of 10, for 25 per pain point. Four pain points make a </w:t>
       </w:r>
       <w:r>
         <w:rPr>
@@ -1466,7 +1466,27 @@
           <w:sz w:val="21"/>
           <w:szCs w:val="21"/>
         </w:rPr>
-        <w:t xml:space="preserve">qualitative feedback</w:t>
+        <w:t xml:space="preserve">case study score out of 100</w:t>
+      </w:r>
+      <w:r>
+        <w:rPr>
+          <w:rFonts w:ascii="Calibri" w:cs="Calibri" w:eastAsia="Calibri" w:hAnsi="Calibri"/>
+          <w:color w:val="3A4C63"/>
+          <w:sz w:val="21"/>
+          <w:szCs w:val="21"/>
+        </w:rPr>
+        <w:t xml:space="preserve">, and the four case studies make an </w:t>
+      </w:r>
+      <w:r>
+        <w:rPr>
+          <w:rFonts w:ascii="Calibri" w:cs="Calibri" w:eastAsia="Calibri" w:hAnsi="Calibri"/>
+          <w:b/>
+          <w:bCs/>
+          <w:color w:val="0D274D"/>
+          <w:sz w:val="21"/>
+          <w:szCs w:val="21"/>
+        </w:rPr>
+        <w:t xml:space="preserve">overall score out of 400</w:t>
       </w:r>
       <w:r>
         <w:rPr>
@@ -1528,6 +1548,17 @@
               </w:rPr>
               <w:t xml:space="preserve">Problem Identifier</w:t>
             </w:r>
+            <w:r>
+              <w:rPr>
+                <w:rFonts w:ascii="Calibri" w:cs="Calibri" w:eastAsia="Calibri" w:hAnsi="Calibri"/>
+                <w:b/>
+                <w:bCs/>
+                <w:color w:val="036C8F"/>
+                <w:sz w:val="14"/>
+                <w:szCs w:val="14"/>
+              </w:rPr>
+              <w:t xml:space="preserve">  out of 5</w:t>
+            </w:r>
           </w:p>
           <w:p>
             <w:pPr>
@@ -1576,6 +1607,17 @@
               </w:rPr>
               <w:t xml:space="preserve">Solution Designer</w:t>
             </w:r>
+            <w:r>
+              <w:rPr>
+                <w:rFonts w:ascii="Calibri" w:cs="Calibri" w:eastAsia="Calibri" w:hAnsi="Calibri"/>
+                <w:b/>
+                <w:bCs/>
+                <w:color w:val="036C8F"/>
+                <w:sz w:val="14"/>
+                <w:szCs w:val="14"/>
+              </w:rPr>
+              <w:t xml:space="preserve">  out of 10</w:t>
+            </w:r>
           </w:p>
           <w:p>
             <w:pPr>
@@ -1623,6 +1665,17 @@
                 <w:szCs w:val="21"/>
               </w:rPr>
               <w:t xml:space="preserve">Value Communicator</w:t>
+            </w:r>
+            <w:r>
+              <w:rPr>
+                <w:rFonts w:ascii="Calibri" w:cs="Calibri" w:eastAsia="Calibri" w:hAnsi="Calibri"/>
+                <w:b/>
+                <w:bCs/>
+                <w:color w:val="036C8F"/>
+                <w:sz w:val="14"/>
+                <w:szCs w:val="14"/>
+              </w:rPr>
+              <w:t xml:space="preserve">  out of 10</w:t>
             </w:r>
           </w:p>
           <w:p>

</xml_diff>

<commit_message>
Grading Guide: make it a reference rubric (no fill-in blanks)
Per feedback, the Grading Guide is now a proctor reference, not a
worksheet:
- A detailed analytic rubric: each dimension (Problem Identifier,
  Solution Designer, Value Communicator) defined across four answer
  levels, Complete / Substantial / Developing / Minimal, each with a
  point range and a behaviour-based descriptor.
- An overall-completion mapping: pain point (out of 25) and case study
  (out of 100) grade bands.
- A per-pain-point answer key: the full-marks (Complete) answer for each
  dimension, as the standard to grade against.
- All fill-in blanks removed; scores are recorded on the Workbook's
  Proctor evaluation page (which keeps the fillable fields).

Proctor steps, the Activity Guide reference, and the README updated to
match. Solution Guide unchanged.

Co-Authored-By: Claude Opus 4.8 <noreply@anthropic.com>
Claude-Session: https://claude.ai/code/session_01QFagQxWq3DUNgqxaEaNjHo
</commit_message>
<xml_diff>
--- a/case-study-pack/docx/HMF-Activity-Guide.docx
+++ b/case-study-pack/docx/HMF-Activity-Guide.docx
@@ -1726,7 +1726,7 @@
           <w:sz w:val="17"/>
           <w:szCs w:val="17"/>
         </w:rPr>
-        <w:t xml:space="preserve"> in the Workbook to identify products themselves; it is a uniform list with no pain-point give-aways. Facilitators evaluate each submitted Workbook against the </w:t>
+        <w:t xml:space="preserve"> in the Workbook to identify products themselves; it is a uniform list with no pain-point give-aways. Facilitators grade each submitted Workbook against the </w:t>
       </w:r>
       <w:r>
         <w:rPr>
@@ -1746,7 +1746,7 @@
           <w:sz w:val="17"/>
           <w:szCs w:val="17"/>
         </w:rPr>
-        <w:t xml:space="preserve">, which breaks down the expected answer for every pain point, and record the score and feedback on the </w:t>
+        <w:t xml:space="preserve">, which gives a scoring rubric and the answer key for every pain point, and record the score and feedback on the </w:t>
       </w:r>
       <w:r>
         <w:rPr>

</xml_diff>

<commit_message>
Add cumulative overall-grade field to the Proctor evaluation page
The blank Proctor evaluation page (in the Workbook) recorded the overall
total out of 400 but had no field for the positive category the Grading
Guide asks proctors to record. Added an "Overall grade" field with the
Best / Better / Good legend to both the blank page and the completed
example, and noted the three categories in the Activity Guide's scoring
summary. The cumulative score and its category are now captured and
described consistently across all documents.

Co-Authored-By: Claude Opus 4.8 <noreply@anthropic.com>
Claude-Session: https://claude.ai/code/session_01QFagQxWq3DUNgqxaEaNjHo
</commit_message>
<xml_diff>
--- a/case-study-pack/docx/HMF-Activity-Guide.docx
+++ b/case-study-pack/docx/HMF-Activity-Guide.docx
@@ -1487,6 +1487,26 @@
           <w:szCs w:val="21"/>
         </w:rPr>
         <w:t xml:space="preserve">overall score out of 400</w:t>
+      </w:r>
+      <w:r>
+        <w:rPr>
+          <w:rFonts w:ascii="Calibri" w:cs="Calibri" w:eastAsia="Calibri" w:hAnsi="Calibri"/>
+          <w:color w:val="3A4C63"/>
+          <w:sz w:val="21"/>
+          <w:szCs w:val="21"/>
+        </w:rPr>
+        <w:t xml:space="preserve">, shared with the team as one of three positive categories, </w:t>
+      </w:r>
+      <w:r>
+        <w:rPr>
+          <w:rFonts w:ascii="Calibri" w:cs="Calibri" w:eastAsia="Calibri" w:hAnsi="Calibri"/>
+          <w:b/>
+          <w:bCs/>
+          <w:color w:val="0D274D"/>
+          <w:sz w:val="21"/>
+          <w:szCs w:val="21"/>
+        </w:rPr>
+        <w:t xml:space="preserve">Best, Better or Good</w:t>
       </w:r>
       <w:r>
         <w:rPr>

</xml_diff>

<commit_message>
Explain cumulative grading across documents; rename overall categories to Advanced/Established/Foundational
- Workbook "How your answers are assessed" now teaches cumulative
  grading with a "Your grade is cumulative" box: pain point (25) to case
  study (100) to a cumulative score out of 400 that gives the overall
  grade, and a note that all sixteen pain points count.
- Rolled the "cumulative" framing consistently into the Activity Guide,
  Solution Guide, Grading Guide, Rubric Sheet, and LLM prompt.
- Replaced the overall categories Best / Better / Good with an absolute,
  positive proficiency ladder: Advanced (300-400), Established (200-299),
  Foundational (up to 199). Updated the Proctor evaluation legend, the
  completed example, the grade table, the LLM prompt schema, README, and
  the sample test-results labels.

Co-Authored-By: Claude Opus 4.8 <noreply@anthropic.com>
Claude-Session: https://claude.ai/code/session_01QFagQxWq3DUNgqxaEaNjHo
</commit_message>
<xml_diff>
--- a/case-study-pack/docx/HMF-Activity-Guide.docx
+++ b/case-study-pack/docx/HMF-Activity-Guide.docx
@@ -1475,7 +1475,7 @@
           <w:sz w:val="21"/>
           <w:szCs w:val="21"/>
         </w:rPr>
-        <w:t xml:space="preserve">, and the four case studies make an </w:t>
+        <w:t xml:space="preserve">, and the four case study scores are added into a </w:t>
       </w:r>
       <w:r>
         <w:rPr>
@@ -1486,7 +1486,7 @@
           <w:sz w:val="21"/>
           <w:szCs w:val="21"/>
         </w:rPr>
-        <w:t xml:space="preserve">overall score out of 400</w:t>
+        <w:t xml:space="preserve">cumulative score out of 400</w:t>
       </w:r>
       <w:r>
         <w:rPr>
@@ -1506,7 +1506,7 @@
           <w:sz w:val="21"/>
           <w:szCs w:val="21"/>
         </w:rPr>
-        <w:t xml:space="preserve">Best, Better or Good</w:t>
+        <w:t xml:space="preserve">Advanced, Established or Foundational</w:t>
       </w:r>
       <w:r>
         <w:rPr>

</xml_diff>